<commit_message>
TS 3.5 Kramam Tamil and Sanskrit
</commit_message>
<xml_diff>
--- a/TS-Kramam/TS-3.5/TS 3.5 Sanskrit Krama Paatam Corrections.docx
+++ b/TS-Kramam/TS-3.5/TS 3.5 Sanskrit Krama Paatam Corrections.docx
@@ -114,7 +114,7 @@
     </w:p>
     <w:tbl>
       <w:tblPr>
-        <w:tblW w:w="14395" w:type="dxa"/>
+        <w:tblW w:w="14537" w:type="dxa"/>
         <w:tblInd w:w="-792" w:type="dxa"/>
         <w:tblBorders>
           <w:top w:val="single" w:sz="4" w:space="0" w:color="000000"/>
@@ -128,10 +128,16 @@
       </w:tblPr>
       <w:tblGrid>
         <w:gridCol w:w="3906"/>
-        <w:gridCol w:w="5103"/>
+        <w:gridCol w:w="4961"/>
+        <w:gridCol w:w="142"/>
         <w:gridCol w:w="5386"/>
+        <w:gridCol w:w="142"/>
       </w:tblGrid>
       <w:tr>
+        <w:trPr>
+          <w:gridAfter w:val="1"/>
+          <w:wAfter w:w="142" w:type="dxa"/>
+        </w:trPr>
         <w:tc>
           <w:tcPr>
             <w:tcW w:w="3906" w:type="dxa"/>
@@ -141,12 +147,16 @@
               <w:spacing w:before="0" w:line="240" w:lineRule="auto"/>
               <w:jc w:val="center"/>
               <w:rPr>
+                <w:b/>
+                <w:bCs/>
                 <w:sz w:val="32"/>
                 <w:szCs w:val="32"/>
               </w:rPr>
             </w:pPr>
             <w:r>
               <w:rPr>
+                <w:b/>
+                <w:bCs/>
                 <w:sz w:val="32"/>
                 <w:szCs w:val="32"/>
               </w:rPr>
@@ -158,12 +168,16 @@
               <w:spacing w:before="0" w:line="240" w:lineRule="auto"/>
               <w:jc w:val="center"/>
               <w:rPr>
+                <w:b/>
+                <w:bCs/>
                 <w:sz w:val="32"/>
                 <w:szCs w:val="32"/>
               </w:rPr>
             </w:pPr>
             <w:r>
               <w:rPr>
+                <w:b/>
+                <w:bCs/>
                 <w:sz w:val="32"/>
                 <w:szCs w:val="32"/>
               </w:rPr>
@@ -174,18 +188,23 @@
         <w:tc>
           <w:tcPr>
             <w:tcW w:w="5103" w:type="dxa"/>
+            <w:gridSpan w:val="2"/>
           </w:tcPr>
           <w:p>
             <w:pPr>
               <w:spacing w:before="0" w:line="240" w:lineRule="auto"/>
               <w:jc w:val="center"/>
               <w:rPr>
+                <w:b/>
+                <w:bCs/>
                 <w:sz w:val="32"/>
                 <w:szCs w:val="32"/>
               </w:rPr>
             </w:pPr>
             <w:r>
               <w:rPr>
+                <w:b/>
+                <w:bCs/>
                 <w:sz w:val="32"/>
                 <w:szCs w:val="32"/>
               </w:rPr>
@@ -203,16 +222,1063 @@
               <w:ind w:right="-18"/>
               <w:jc w:val="center"/>
               <w:rPr>
+                <w:b/>
+                <w:bCs/>
                 <w:sz w:val="32"/>
                 <w:szCs w:val="32"/>
               </w:rPr>
             </w:pPr>
             <w:r>
               <w:rPr>
+                <w:b/>
+                <w:bCs/>
                 <w:sz w:val="32"/>
                 <w:szCs w:val="32"/>
               </w:rPr>
               <w:t>To be read as or corrected as</w:t>
+            </w:r>
+          </w:p>
+        </w:tc>
+      </w:tr>
+      <w:tr>
+        <w:trPr>
+          <w:gridAfter w:val="1"/>
+          <w:wAfter w:w="142" w:type="dxa"/>
+          <w:trHeight w:val="1118"/>
+        </w:trPr>
+        <w:tc>
+          <w:tcPr>
+            <w:tcW w:w="3906" w:type="dxa"/>
+          </w:tcPr>
+          <w:p>
+            <w:pPr>
+              <w:widowControl w:val="0"/>
+              <w:tabs>
+                <w:tab w:val="left" w:pos="993"/>
+              </w:tabs>
+              <w:autoSpaceDE w:val="0"/>
+              <w:autoSpaceDN w:val="0"/>
+              <w:adjustRightInd w:val="0"/>
+              <w:spacing w:before="0" w:line="240" w:lineRule="auto"/>
+              <w:ind w:right="297"/>
+              <w:rPr>
+                <w:rFonts w:cs="Arial"/>
+                <w:b/>
+                <w:color w:val="000000"/>
+                <w:sz w:val="28"/>
+                <w:szCs w:val="32"/>
+              </w:rPr>
+            </w:pPr>
+            <w:r>
+              <w:rPr>
+                <w:rFonts w:cs="Arial"/>
+                <w:b/>
+                <w:color w:val="000000"/>
+                <w:sz w:val="28"/>
+                <w:szCs w:val="32"/>
+              </w:rPr>
+              <w:t>T.S.</w:t>
+            </w:r>
+            <w:r>
+              <w:rPr>
+                <w:rFonts w:cs="Arial"/>
+                <w:b/>
+                <w:color w:val="000000"/>
+                <w:sz w:val="28"/>
+                <w:szCs w:val="32"/>
+              </w:rPr>
+              <w:t xml:space="preserve">3.5.3.1 </w:t>
+            </w:r>
+            <w:r>
+              <w:rPr>
+                <w:rFonts w:cs="Arial"/>
+                <w:b/>
+                <w:color w:val="000000"/>
+                <w:sz w:val="28"/>
+                <w:szCs w:val="32"/>
+              </w:rPr>
+              <w:t>– Kramam</w:t>
+            </w:r>
+          </w:p>
+          <w:p>
+            <w:pPr>
+              <w:widowControl w:val="0"/>
+              <w:tabs>
+                <w:tab w:val="left" w:pos="993"/>
+              </w:tabs>
+              <w:autoSpaceDE w:val="0"/>
+              <w:autoSpaceDN w:val="0"/>
+              <w:adjustRightInd w:val="0"/>
+              <w:spacing w:before="0" w:line="240" w:lineRule="auto"/>
+              <w:ind w:right="297"/>
+              <w:rPr>
+                <w:rFonts w:cs="Arial"/>
+                <w:b/>
+                <w:color w:val="000000"/>
+                <w:sz w:val="28"/>
+                <w:szCs w:val="32"/>
+                <w:lang w:val="en-IN"/>
+              </w:rPr>
+            </w:pPr>
+            <w:r>
+              <w:rPr>
+                <w:rFonts w:cs="Arial"/>
+                <w:b/>
+                <w:color w:val="000000"/>
+                <w:sz w:val="28"/>
+                <w:szCs w:val="32"/>
+                <w:lang w:val="en-IN"/>
+              </w:rPr>
+              <w:t xml:space="preserve">Krama Vaakyam No. - </w:t>
+            </w:r>
+            <w:r>
+              <w:rPr>
+                <w:rFonts w:cs="Arial"/>
+                <w:b/>
+                <w:color w:val="000000"/>
+                <w:sz w:val="28"/>
+                <w:szCs w:val="32"/>
+                <w:lang w:val="en-IN"/>
+              </w:rPr>
+              <w:t>42</w:t>
+            </w:r>
+          </w:p>
+          <w:p>
+            <w:pPr>
+              <w:widowControl w:val="0"/>
+              <w:tabs>
+                <w:tab w:val="left" w:pos="993"/>
+              </w:tabs>
+              <w:autoSpaceDE w:val="0"/>
+              <w:autoSpaceDN w:val="0"/>
+              <w:adjustRightInd w:val="0"/>
+              <w:spacing w:before="0" w:line="240" w:lineRule="auto"/>
+              <w:ind w:right="297"/>
+              <w:rPr>
+                <w:rFonts w:cs="Arial"/>
+                <w:b/>
+                <w:color w:val="000000"/>
+                <w:sz w:val="28"/>
+                <w:szCs w:val="32"/>
+              </w:rPr>
+            </w:pPr>
+            <w:r>
+              <w:rPr>
+                <w:rFonts w:cs="Arial"/>
+                <w:b/>
+                <w:color w:val="000000"/>
+                <w:sz w:val="28"/>
+                <w:szCs w:val="32"/>
+                <w:lang w:val="it-IT"/>
+              </w:rPr>
+              <w:t>Panchaati No</w:t>
+            </w:r>
+            <w:r>
+              <w:rPr>
+                <w:rFonts w:cs="Arial"/>
+                <w:b/>
+                <w:color w:val="000000"/>
+                <w:szCs w:val="32"/>
+                <w:lang w:val="it-IT"/>
+              </w:rPr>
+              <w:t xml:space="preserve">. - </w:t>
+            </w:r>
+            <w:r>
+              <w:rPr>
+                <w:rFonts w:cs="Arial"/>
+                <w:b/>
+                <w:color w:val="000000"/>
+                <w:sz w:val="28"/>
+                <w:szCs w:val="32"/>
+                <w:lang w:val="it-IT"/>
+              </w:rPr>
+              <w:t>1</w:t>
+            </w:r>
+            <w:r>
+              <w:rPr>
+                <w:rFonts w:cs="Arial"/>
+                <w:b/>
+                <w:color w:val="000000"/>
+                <w:sz w:val="28"/>
+                <w:szCs w:val="32"/>
+                <w:lang w:val="it-IT"/>
+              </w:rPr>
+              <w:t>0</w:t>
+            </w:r>
+          </w:p>
+        </w:tc>
+        <w:tc>
+          <w:tcPr>
+            <w:tcW w:w="5103" w:type="dxa"/>
+            <w:gridSpan w:val="2"/>
+          </w:tcPr>
+          <w:p>
+            <w:pPr>
+              <w:widowControl w:val="0"/>
+              <w:autoSpaceDE w:val="0"/>
+              <w:autoSpaceDN w:val="0"/>
+              <w:adjustRightInd w:val="0"/>
+              <w:spacing w:before="0" w:line="240" w:lineRule="auto"/>
+              <w:rPr>
+                <w:rFonts w:ascii="BRH Devanagari Extra" w:hAnsi="BRH Devanagari Extra" w:cs="BRH Devanagari Extra"/>
+                <w:color w:val="000000"/>
+                <w:sz w:val="40"/>
+                <w:szCs w:val="40"/>
+              </w:rPr>
+            </w:pPr>
+            <w:r>
+              <w:rPr>
+                <w:rFonts w:ascii="Latha" w:hAnsi="Latha" w:cs="Latha"/>
+                <w:sz w:val="28"/>
+                <w:szCs w:val="28"/>
+                <w:cs/>
+                <w:lang w:bidi="ta-IN"/>
+              </w:rPr>
+              <w:t>ஏ</w:t>
+            </w:r>
+            <w:r>
+              <w:rPr>
+                <w:rFonts w:ascii="BRH Tamil Tab Extra" w:hAnsi="BRH Tamil Tab Extra" w:cs="Latha"/>
+                <w:b/>
+                <w:sz w:val="36"/>
+                <w:szCs w:val="28"/>
+                <w:lang w:bidi="ta-IN"/>
+              </w:rPr>
+              <w:t>…</w:t>
+            </w:r>
+            <w:r>
+              <w:rPr>
+                <w:rFonts w:ascii="Latha" w:hAnsi="Latha" w:cs="Latha"/>
+                <w:sz w:val="28"/>
+                <w:szCs w:val="28"/>
+                <w:cs/>
+                <w:lang w:bidi="ta-IN"/>
+              </w:rPr>
+              <w:t>னா</w:t>
+            </w:r>
+            <w:r>
+              <w:rPr>
+                <w:rFonts w:ascii="BRH Tamil Tab Extra" w:hAnsi="BRH Tamil Tab Extra" w:cs="Latha"/>
+                <w:b/>
+                <w:sz w:val="36"/>
+                <w:szCs w:val="28"/>
+                <w:lang w:bidi="ta-IN"/>
+              </w:rPr>
+              <w:t>…</w:t>
+            </w:r>
+            <w:r>
+              <w:rPr>
+                <w:rFonts w:ascii="Latha" w:hAnsi="Latha" w:cs="Latha"/>
+                <w:sz w:val="28"/>
+                <w:szCs w:val="28"/>
+                <w:cs/>
+                <w:lang w:bidi="ta-IN"/>
+              </w:rPr>
+              <w:t>ன்</w:t>
+            </w:r>
+            <w:r>
+              <w:rPr>
+                <w:rFonts w:ascii="Latha" w:hAnsi="Latha" w:cs="Latha"/>
+                <w:sz w:val="28"/>
+                <w:szCs w:val="28"/>
+                <w:lang w:bidi="ta-IN"/>
+              </w:rPr>
+              <w:t xml:space="preserve"> </w:t>
+            </w:r>
+            <w:r>
+              <w:rPr>
+                <w:rFonts w:ascii="Latha" w:hAnsi="Latha" w:cs="Latha" w:hint="cs"/>
+                <w:sz w:val="28"/>
+                <w:szCs w:val="28"/>
+                <w:highlight w:val="yellow"/>
+                <w:cs/>
+                <w:lang w:bidi="ta-IN"/>
+              </w:rPr>
+              <w:t>கா</w:t>
+            </w:r>
+            <w:r>
+              <w:rPr>
+                <w:rFonts w:ascii="BRH Tamil Tab Extra" w:hAnsi="BRH Tamil Tab Extra" w:cs="Latha"/>
+                <w:b/>
+                <w:sz w:val="36"/>
+                <w:szCs w:val="28"/>
+                <w:highlight w:val="yellow"/>
+                <w:lang w:bidi="ta-IN"/>
+              </w:rPr>
+              <w:t>…</w:t>
+            </w:r>
+            <w:r>
+              <w:rPr>
+                <w:rFonts w:ascii="Latha" w:hAnsi="Latha" w:cs="Latha"/>
+                <w:sz w:val="28"/>
+                <w:szCs w:val="28"/>
+                <w:cs/>
+                <w:lang w:bidi="ta-IN"/>
+              </w:rPr>
+              <w:t>மா</w:t>
+            </w:r>
+            <w:r>
+              <w:rPr>
+                <w:rFonts w:ascii="BRH Tamil Tab Extra" w:hAnsi="BRH Tamil Tab Extra" w:cs="Latha"/>
+                <w:b/>
+                <w:sz w:val="36"/>
+                <w:szCs w:val="28"/>
+                <w:lang w:bidi="ta-IN"/>
+              </w:rPr>
+              <w:t>…</w:t>
+            </w:r>
+            <w:r>
+              <w:rPr>
+                <w:rFonts w:ascii="Latha" w:hAnsi="Latha" w:cs="Latha"/>
+                <w:sz w:val="28"/>
+                <w:szCs w:val="28"/>
+                <w:cs/>
+                <w:lang w:bidi="ta-IN"/>
+              </w:rPr>
+              <w:t>மி</w:t>
+            </w:r>
+            <w:r>
+              <w:rPr>
+                <w:rFonts w:ascii="BRH Tamil Tab Extra" w:hAnsi="BRH Tamil Tab Extra" w:cs="Latha"/>
+                <w:b/>
+                <w:sz w:val="36"/>
+                <w:szCs w:val="28"/>
+                <w:lang w:bidi="ta-IN"/>
+              </w:rPr>
+              <w:t>…</w:t>
+            </w:r>
+            <w:r>
+              <w:rPr>
+                <w:rFonts w:ascii="Latha" w:hAnsi="Latha" w:cs="Latha"/>
+                <w:sz w:val="28"/>
+                <w:szCs w:val="28"/>
+                <w:lang w:bidi="ta-IN"/>
+              </w:rPr>
+              <w:t xml:space="preserve"> | </w:t>
+            </w:r>
+            <w:r>
+              <w:rPr>
+                <w:rFonts w:ascii="Latha" w:hAnsi="Latha" w:cs="Latha"/>
+                <w:sz w:val="28"/>
+                <w:szCs w:val="28"/>
+                <w:cs/>
+                <w:lang w:bidi="ta-IN"/>
+              </w:rPr>
+              <w:t>க்ரா</w:t>
+            </w:r>
+            <w:r>
+              <w:rPr>
+                <w:rFonts w:ascii="BRH Tamil Tab Extra" w:hAnsi="BRH Tamil Tab Extra" w:cs="Latha"/>
+                <w:b/>
+                <w:sz w:val="36"/>
+                <w:szCs w:val="28"/>
+                <w:lang w:bidi="ta-IN"/>
+              </w:rPr>
+              <w:t>…</w:t>
+            </w:r>
+            <w:r>
+              <w:rPr>
+                <w:rFonts w:ascii="Latha" w:hAnsi="Latha" w:cs="Latha"/>
+                <w:sz w:val="28"/>
+                <w:szCs w:val="28"/>
+                <w:cs/>
+                <w:lang w:bidi="ta-IN"/>
+              </w:rPr>
+              <w:t>மா</w:t>
+            </w:r>
+            <w:r>
+              <w:rPr>
+                <w:rFonts w:ascii="BRH Tamil Tab Extra" w:hAnsi="BRH Tamil Tab Extra" w:cs="Latha"/>
+                <w:b/>
+                <w:sz w:val="36"/>
+                <w:szCs w:val="28"/>
+                <w:lang w:bidi="ta-IN"/>
+              </w:rPr>
+              <w:t>…</w:t>
+            </w:r>
+            <w:r>
+              <w:rPr>
+                <w:rFonts w:ascii="Latha" w:hAnsi="Latha" w:cs="Latha"/>
+                <w:sz w:val="28"/>
+                <w:szCs w:val="28"/>
+                <w:cs/>
+                <w:lang w:bidi="ta-IN"/>
+              </w:rPr>
+              <w:t>மீந்த்</w:t>
+            </w:r>
+            <w:r>
+              <w:rPr>
+                <w:rFonts w:ascii="Latha" w:hAnsi="Latha" w:cs="Latha"/>
+                <w:b/>
+                <w:bCs/>
+                <w:position w:val="-12"/>
+                <w:sz w:val="28"/>
+                <w:szCs w:val="28"/>
+                <w:cs/>
+                <w:lang w:bidi="ta-IN"/>
+              </w:rPr>
+              <w:t>3</w:t>
+            </w:r>
+            <w:r>
+              <w:rPr>
+                <w:rFonts w:ascii="Latha" w:hAnsi="Latha" w:cs="Latha"/>
+                <w:sz w:val="28"/>
+                <w:szCs w:val="28"/>
+                <w:cs/>
+                <w:lang w:bidi="ta-IN"/>
+              </w:rPr>
+              <w:t>ரே</w:t>
+            </w:r>
+            <w:r>
+              <w:rPr>
+                <w:rFonts w:ascii="BRH Tamil Tab Extra" w:hAnsi="BRH Tamil Tab Extra" w:cs="Latha"/>
+                <w:b/>
+                <w:sz w:val="36"/>
+                <w:szCs w:val="28"/>
+                <w:lang w:bidi="ta-IN"/>
+              </w:rPr>
+              <w:t>†</w:t>
+            </w:r>
+            <w:r>
+              <w:rPr>
+                <w:rFonts w:ascii="Latha" w:hAnsi="Latha" w:cs="Latha"/>
+                <w:sz w:val="28"/>
+                <w:szCs w:val="28"/>
+                <w:cs/>
+                <w:lang w:bidi="ta-IN"/>
+              </w:rPr>
+              <w:t>ண</w:t>
+            </w:r>
+            <w:r>
+              <w:rPr>
+                <w:rFonts w:ascii="Latha" w:hAnsi="Latha" w:cs="Latha"/>
+                <w:sz w:val="28"/>
+                <w:szCs w:val="28"/>
+                <w:lang w:bidi="ta-IN"/>
+              </w:rPr>
+              <w:t xml:space="preserve"> |</w:t>
+            </w:r>
+          </w:p>
+        </w:tc>
+        <w:tc>
+          <w:tcPr>
+            <w:tcW w:w="5386" w:type="dxa"/>
+          </w:tcPr>
+          <w:p>
+            <w:pPr>
+              <w:spacing w:before="0" w:line="240" w:lineRule="auto"/>
+              <w:rPr>
+                <w:rFonts w:ascii="BRH Devanagari Extra" w:hAnsi="BRH Devanagari Extra" w:cs="BRH Devanagari Extra"/>
+                <w:color w:val="000000"/>
+                <w:sz w:val="40"/>
+                <w:szCs w:val="40"/>
+              </w:rPr>
+            </w:pPr>
+            <w:r>
+              <w:rPr>
+                <w:rFonts w:ascii="Latha" w:hAnsi="Latha" w:cs="Latha"/>
+                <w:sz w:val="28"/>
+                <w:szCs w:val="28"/>
+                <w:cs/>
+                <w:lang w:bidi="ta-IN"/>
+              </w:rPr>
+              <w:t>ஏ</w:t>
+            </w:r>
+            <w:r>
+              <w:rPr>
+                <w:rFonts w:ascii="BRH Tamil Tab Extra" w:hAnsi="BRH Tamil Tab Extra" w:cs="Latha"/>
+                <w:b/>
+                <w:sz w:val="36"/>
+                <w:szCs w:val="28"/>
+                <w:lang w:bidi="ta-IN"/>
+              </w:rPr>
+              <w:t>…</w:t>
+            </w:r>
+            <w:r>
+              <w:rPr>
+                <w:rFonts w:ascii="Latha" w:hAnsi="Latha" w:cs="Latha"/>
+                <w:sz w:val="28"/>
+                <w:szCs w:val="28"/>
+                <w:cs/>
+                <w:lang w:bidi="ta-IN"/>
+              </w:rPr>
+              <w:t>னா</w:t>
+            </w:r>
+            <w:r>
+              <w:rPr>
+                <w:rFonts w:ascii="BRH Tamil Tab Extra" w:hAnsi="BRH Tamil Tab Extra" w:cs="Latha"/>
+                <w:b/>
+                <w:sz w:val="36"/>
+                <w:szCs w:val="28"/>
+                <w:lang w:bidi="ta-IN"/>
+              </w:rPr>
+              <w:t>…</w:t>
+            </w:r>
+            <w:r>
+              <w:rPr>
+                <w:rFonts w:ascii="Latha" w:hAnsi="Latha" w:cs="Latha"/>
+                <w:sz w:val="28"/>
+                <w:szCs w:val="28"/>
+                <w:cs/>
+                <w:lang w:bidi="ta-IN"/>
+              </w:rPr>
+              <w:t>ன்</w:t>
+            </w:r>
+            <w:r>
+              <w:rPr>
+                <w:rFonts w:ascii="Latha" w:hAnsi="Latha" w:cs="Latha"/>
+                <w:sz w:val="28"/>
+                <w:szCs w:val="28"/>
+                <w:lang w:bidi="ta-IN"/>
+              </w:rPr>
+              <w:t xml:space="preserve"> </w:t>
+            </w:r>
+            <w:r>
+              <w:rPr>
+                <w:rFonts w:ascii="Latha" w:hAnsi="Latha" w:cs="Latha"/>
+                <w:sz w:val="28"/>
+                <w:szCs w:val="28"/>
+                <w:cs/>
+                <w:lang w:bidi="ta-IN"/>
+              </w:rPr>
+              <w:t>க்</w:t>
+            </w:r>
+            <w:r>
+              <w:rPr>
+                <w:rFonts w:ascii="Latha" w:hAnsi="Latha" w:cs="Latha"/>
+                <w:sz w:val="28"/>
+                <w:szCs w:val="28"/>
+                <w:highlight w:val="green"/>
+                <w:cs/>
+                <w:lang w:bidi="ta-IN"/>
+              </w:rPr>
+              <w:t>ரா</w:t>
+            </w:r>
+            <w:r>
+              <w:rPr>
+                <w:rFonts w:ascii="BRH Tamil Tab Extra" w:hAnsi="BRH Tamil Tab Extra" w:cs="Latha"/>
+                <w:b/>
+                <w:sz w:val="36"/>
+                <w:szCs w:val="28"/>
+                <w:lang w:bidi="ta-IN"/>
+              </w:rPr>
+              <w:t>…</w:t>
+            </w:r>
+            <w:r>
+              <w:rPr>
+                <w:rFonts w:ascii="Latha" w:hAnsi="Latha" w:cs="Latha"/>
+                <w:sz w:val="28"/>
+                <w:szCs w:val="28"/>
+                <w:cs/>
+                <w:lang w:bidi="ta-IN"/>
+              </w:rPr>
+              <w:t>மா</w:t>
+            </w:r>
+            <w:r>
+              <w:rPr>
+                <w:rFonts w:ascii="BRH Tamil Tab Extra" w:hAnsi="BRH Tamil Tab Extra" w:cs="Latha"/>
+                <w:b/>
+                <w:sz w:val="36"/>
+                <w:szCs w:val="28"/>
+                <w:lang w:bidi="ta-IN"/>
+              </w:rPr>
+              <w:t>…</w:t>
+            </w:r>
+            <w:r>
+              <w:rPr>
+                <w:rFonts w:ascii="Latha" w:hAnsi="Latha" w:cs="Latha"/>
+                <w:sz w:val="28"/>
+                <w:szCs w:val="28"/>
+                <w:cs/>
+                <w:lang w:bidi="ta-IN"/>
+              </w:rPr>
+              <w:t>மி</w:t>
+            </w:r>
+            <w:r>
+              <w:rPr>
+                <w:rFonts w:ascii="BRH Tamil Tab Extra" w:hAnsi="BRH Tamil Tab Extra" w:cs="Latha"/>
+                <w:b/>
+                <w:sz w:val="36"/>
+                <w:szCs w:val="28"/>
+                <w:lang w:bidi="ta-IN"/>
+              </w:rPr>
+              <w:t>…</w:t>
+            </w:r>
+            <w:r>
+              <w:rPr>
+                <w:rFonts w:ascii="Latha" w:hAnsi="Latha" w:cs="Latha"/>
+                <w:sz w:val="28"/>
+                <w:szCs w:val="28"/>
+                <w:lang w:bidi="ta-IN"/>
+              </w:rPr>
+              <w:t xml:space="preserve"> | </w:t>
+            </w:r>
+            <w:r>
+              <w:rPr>
+                <w:rFonts w:ascii="Latha" w:hAnsi="Latha" w:cs="Latha"/>
+                <w:sz w:val="28"/>
+                <w:szCs w:val="28"/>
+                <w:cs/>
+                <w:lang w:bidi="ta-IN"/>
+              </w:rPr>
+              <w:t>க்ரா</w:t>
+            </w:r>
+            <w:r>
+              <w:rPr>
+                <w:rFonts w:ascii="BRH Tamil Tab Extra" w:hAnsi="BRH Tamil Tab Extra" w:cs="Latha"/>
+                <w:b/>
+                <w:sz w:val="36"/>
+                <w:szCs w:val="28"/>
+                <w:lang w:bidi="ta-IN"/>
+              </w:rPr>
+              <w:t>…</w:t>
+            </w:r>
+            <w:r>
+              <w:rPr>
+                <w:rFonts w:ascii="Latha" w:hAnsi="Latha" w:cs="Latha"/>
+                <w:sz w:val="28"/>
+                <w:szCs w:val="28"/>
+                <w:cs/>
+                <w:lang w:bidi="ta-IN"/>
+              </w:rPr>
+              <w:t>மா</w:t>
+            </w:r>
+            <w:r>
+              <w:rPr>
+                <w:rFonts w:ascii="BRH Tamil Tab Extra" w:hAnsi="BRH Tamil Tab Extra" w:cs="Latha"/>
+                <w:b/>
+                <w:sz w:val="36"/>
+                <w:szCs w:val="28"/>
+                <w:lang w:bidi="ta-IN"/>
+              </w:rPr>
+              <w:t>…</w:t>
+            </w:r>
+            <w:r>
+              <w:rPr>
+                <w:rFonts w:ascii="Latha" w:hAnsi="Latha" w:cs="Latha"/>
+                <w:sz w:val="28"/>
+                <w:szCs w:val="28"/>
+                <w:cs/>
+                <w:lang w:bidi="ta-IN"/>
+              </w:rPr>
+              <w:t>மீந்த்</w:t>
+            </w:r>
+            <w:r>
+              <w:rPr>
+                <w:rFonts w:ascii="Latha" w:hAnsi="Latha" w:cs="Latha"/>
+                <w:b/>
+                <w:bCs/>
+                <w:position w:val="-12"/>
+                <w:sz w:val="28"/>
+                <w:szCs w:val="28"/>
+                <w:cs/>
+                <w:lang w:bidi="ta-IN"/>
+              </w:rPr>
+              <w:t>3</w:t>
+            </w:r>
+            <w:r>
+              <w:rPr>
+                <w:rFonts w:ascii="Latha" w:hAnsi="Latha" w:cs="Latha"/>
+                <w:sz w:val="28"/>
+                <w:szCs w:val="28"/>
+                <w:cs/>
+                <w:lang w:bidi="ta-IN"/>
+              </w:rPr>
+              <w:t>ரே</w:t>
+            </w:r>
+            <w:r>
+              <w:rPr>
+                <w:rFonts w:ascii="BRH Tamil Tab Extra" w:hAnsi="BRH Tamil Tab Extra" w:cs="Latha"/>
+                <w:b/>
+                <w:sz w:val="36"/>
+                <w:szCs w:val="28"/>
+                <w:lang w:bidi="ta-IN"/>
+              </w:rPr>
+              <w:t>†</w:t>
+            </w:r>
+            <w:r>
+              <w:rPr>
+                <w:rFonts w:ascii="Latha" w:hAnsi="Latha" w:cs="Latha"/>
+                <w:sz w:val="28"/>
+                <w:szCs w:val="28"/>
+                <w:cs/>
+                <w:lang w:bidi="ta-IN"/>
+              </w:rPr>
+              <w:t>ண</w:t>
+            </w:r>
+            <w:r>
+              <w:rPr>
+                <w:rFonts w:ascii="Latha" w:hAnsi="Latha" w:cs="Latha"/>
+                <w:sz w:val="28"/>
+                <w:szCs w:val="28"/>
+                <w:lang w:bidi="ta-IN"/>
+              </w:rPr>
+              <w:t xml:space="preserve"> |</w:t>
+            </w:r>
+          </w:p>
+        </w:tc>
+      </w:tr>
+      <w:tr>
+        <w:trPr>
+          <w:gridAfter w:val="1"/>
+          <w:wAfter w:w="142" w:type="dxa"/>
+          <w:trHeight w:val="1118"/>
+        </w:trPr>
+        <w:tc>
+          <w:tcPr>
+            <w:tcW w:w="3906" w:type="dxa"/>
+          </w:tcPr>
+          <w:p>
+            <w:pPr>
+              <w:widowControl w:val="0"/>
+              <w:tabs>
+                <w:tab w:val="left" w:pos="993"/>
+              </w:tabs>
+              <w:autoSpaceDE w:val="0"/>
+              <w:autoSpaceDN w:val="0"/>
+              <w:adjustRightInd w:val="0"/>
+              <w:spacing w:before="0" w:line="240" w:lineRule="auto"/>
+              <w:ind w:right="297"/>
+              <w:rPr>
+                <w:rFonts w:cs="Arial"/>
+                <w:b/>
+                <w:color w:val="000000"/>
+                <w:sz w:val="28"/>
+                <w:szCs w:val="32"/>
+              </w:rPr>
+            </w:pPr>
+            <w:r>
+              <w:rPr>
+                <w:rFonts w:cs="Arial"/>
+                <w:b/>
+                <w:color w:val="000000"/>
+                <w:sz w:val="28"/>
+                <w:szCs w:val="32"/>
+              </w:rPr>
+              <w:t>T.S.</w:t>
+            </w:r>
+            <w:r>
+              <w:rPr>
+                <w:rFonts w:cs="Arial"/>
+                <w:b/>
+                <w:color w:val="000000"/>
+                <w:sz w:val="28"/>
+                <w:szCs w:val="32"/>
+              </w:rPr>
+              <w:t xml:space="preserve">3.5.4.1 </w:t>
+            </w:r>
+            <w:r>
+              <w:rPr>
+                <w:rFonts w:cs="Arial"/>
+                <w:b/>
+                <w:color w:val="000000"/>
+                <w:sz w:val="28"/>
+                <w:szCs w:val="32"/>
+              </w:rPr>
+              <w:t>– Kramam</w:t>
+            </w:r>
+          </w:p>
+          <w:p>
+            <w:pPr>
+              <w:widowControl w:val="0"/>
+              <w:tabs>
+                <w:tab w:val="left" w:pos="993"/>
+              </w:tabs>
+              <w:autoSpaceDE w:val="0"/>
+              <w:autoSpaceDN w:val="0"/>
+              <w:adjustRightInd w:val="0"/>
+              <w:spacing w:before="0" w:line="240" w:lineRule="auto"/>
+              <w:ind w:right="297"/>
+              <w:rPr>
+                <w:rFonts w:cs="Arial"/>
+                <w:b/>
+                <w:color w:val="000000"/>
+                <w:sz w:val="28"/>
+                <w:szCs w:val="32"/>
+                <w:lang w:val="en-IN"/>
+              </w:rPr>
+            </w:pPr>
+            <w:r>
+              <w:rPr>
+                <w:rFonts w:cs="Arial"/>
+                <w:b/>
+                <w:color w:val="000000"/>
+                <w:sz w:val="28"/>
+                <w:szCs w:val="32"/>
+                <w:lang w:val="en-IN"/>
+              </w:rPr>
+              <w:t>Krama Vaakyam No. - 27</w:t>
+            </w:r>
+          </w:p>
+          <w:p>
+            <w:pPr>
+              <w:widowControl w:val="0"/>
+              <w:tabs>
+                <w:tab w:val="left" w:pos="993"/>
+              </w:tabs>
+              <w:autoSpaceDE w:val="0"/>
+              <w:autoSpaceDN w:val="0"/>
+              <w:adjustRightInd w:val="0"/>
+              <w:spacing w:before="0" w:line="240" w:lineRule="auto"/>
+              <w:ind w:right="297"/>
+              <w:rPr>
+                <w:rFonts w:cs="Arial"/>
+                <w:b/>
+                <w:color w:val="000000"/>
+                <w:sz w:val="28"/>
+                <w:szCs w:val="32"/>
+                <w:lang w:val="it-IT"/>
+              </w:rPr>
+            </w:pPr>
+            <w:r>
+              <w:rPr>
+                <w:rFonts w:cs="Arial"/>
+                <w:b/>
+                <w:color w:val="000000"/>
+                <w:sz w:val="28"/>
+                <w:szCs w:val="32"/>
+                <w:lang w:val="it-IT"/>
+              </w:rPr>
+              <w:t>Panchaati No</w:t>
+            </w:r>
+            <w:r>
+              <w:rPr>
+                <w:rFonts w:cs="Arial"/>
+                <w:b/>
+                <w:color w:val="000000"/>
+                <w:szCs w:val="32"/>
+                <w:lang w:val="it-IT"/>
+              </w:rPr>
+              <w:t xml:space="preserve">. - </w:t>
+            </w:r>
+            <w:r>
+              <w:rPr>
+                <w:rFonts w:cs="Arial"/>
+                <w:b/>
+                <w:color w:val="000000"/>
+                <w:sz w:val="28"/>
+                <w:szCs w:val="32"/>
+                <w:lang w:val="it-IT"/>
+              </w:rPr>
+              <w:t>1</w:t>
+            </w:r>
+            <w:r>
+              <w:rPr>
+                <w:rFonts w:cs="Arial"/>
+                <w:b/>
+                <w:color w:val="000000"/>
+                <w:sz w:val="28"/>
+                <w:szCs w:val="32"/>
+                <w:lang w:val="it-IT"/>
+              </w:rPr>
+              <w:t>2</w:t>
+            </w:r>
+          </w:p>
+        </w:tc>
+        <w:tc>
+          <w:tcPr>
+            <w:tcW w:w="5103" w:type="dxa"/>
+            <w:gridSpan w:val="2"/>
+          </w:tcPr>
+          <w:p>
+            <w:pPr>
+              <w:widowControl w:val="0"/>
+              <w:autoSpaceDE w:val="0"/>
+              <w:autoSpaceDN w:val="0"/>
+              <w:adjustRightInd w:val="0"/>
+              <w:spacing w:before="0" w:line="240" w:lineRule="auto"/>
+              <w:rPr>
+                <w:rFonts w:ascii="BRH Malayalam Extra" w:hAnsi="BRH Malayalam Extra" w:cs="BRH Malayalam Extra"/>
+                <w:color w:val="000000"/>
+                <w:sz w:val="36"/>
+                <w:szCs w:val="40"/>
+              </w:rPr>
+            </w:pPr>
+            <w:proofErr w:type="spellStart"/>
+            <w:r>
+              <w:rPr>
+                <w:rFonts w:ascii="BRH Devanagari Extra" w:hAnsi="BRH Devanagari Extra" w:cs="BRH Devanagari Extra"/>
+                <w:color w:val="000000"/>
+                <w:sz w:val="40"/>
+                <w:szCs w:val="40"/>
+              </w:rPr>
+              <w:t>rÉÉå</w:t>
+            </w:r>
+            <w:proofErr w:type="spellEnd"/>
+            <w:r>
+              <w:rPr>
+                <w:rFonts w:ascii="BRH Devanagari Extra" w:hAnsi="BRH Devanagari Extra" w:cs="BRH Devanagari Extra"/>
+                <w:color w:val="000000"/>
+                <w:sz w:val="40"/>
+                <w:szCs w:val="40"/>
+              </w:rPr>
+              <w:t xml:space="preserve"> </w:t>
+            </w:r>
+            <w:proofErr w:type="spellStart"/>
+            <w:r>
+              <w:rPr>
+                <w:rFonts w:ascii="BRH Devanagari Extra" w:hAnsi="BRH Devanagari Extra" w:cs="BRH Devanagari Extra"/>
+                <w:color w:val="000000"/>
+                <w:sz w:val="40"/>
+                <w:szCs w:val="40"/>
+              </w:rPr>
+              <w:t>AÎxiÉþ</w:t>
+            </w:r>
+            <w:proofErr w:type="spellEnd"/>
+            <w:r>
+              <w:rPr>
+                <w:rFonts w:ascii="BRH Devanagari Extra" w:hAnsi="BRH Devanagari Extra" w:cs="BRH Devanagari Extra"/>
+                <w:color w:val="000000"/>
+                <w:sz w:val="40"/>
+                <w:szCs w:val="40"/>
+              </w:rPr>
+              <w:t xml:space="preserve"> | </w:t>
+            </w:r>
+            <w:proofErr w:type="spellStart"/>
+            <w:r>
+              <w:rPr>
+                <w:rFonts w:ascii="BRH Devanagari Extra" w:hAnsi="BRH Devanagari Extra" w:cs="BRH Devanagari Extra"/>
+                <w:color w:val="000000"/>
+                <w:sz w:val="40"/>
+                <w:szCs w:val="40"/>
+              </w:rPr>
+              <w:t>A</w:t>
+            </w:r>
+            <w:r>
+              <w:rPr>
+                <w:rFonts w:ascii="BRH Devanagari Extra" w:hAnsi="BRH Devanagari Extra" w:cs="BRH Devanagari Extra"/>
+                <w:color w:val="000000"/>
+                <w:sz w:val="40"/>
+                <w:szCs w:val="40"/>
+                <w:highlight w:val="yellow"/>
+              </w:rPr>
+              <w:t>xiÉÏ</w:t>
+            </w:r>
+            <w:proofErr w:type="spellEnd"/>
+            <w:r>
+              <w:rPr>
+                <w:rFonts w:ascii="BRH Malayalam Extra" w:hAnsi="BRH Malayalam Extra" w:cs="BRH Devanagari Extra"/>
+                <w:b/>
+                <w:color w:val="000000"/>
+                <w:sz w:val="32"/>
+                <w:szCs w:val="40"/>
+              </w:rPr>
+              <w:t>–</w:t>
+            </w:r>
+            <w:proofErr w:type="spellStart"/>
+            <w:r>
+              <w:rPr>
+                <w:rFonts w:ascii="BRH Devanagari Extra" w:hAnsi="BRH Devanagari Extra" w:cs="BRH Devanagari Extra"/>
+                <w:color w:val="000000"/>
+                <w:sz w:val="40"/>
+                <w:szCs w:val="40"/>
+              </w:rPr>
+              <w:t>irÉÎxiÉþ</w:t>
+            </w:r>
+            <w:proofErr w:type="spellEnd"/>
+            <w:r>
+              <w:rPr>
+                <w:rFonts w:ascii="BRH Devanagari Extra" w:hAnsi="BRH Devanagari Extra" w:cs="BRH Devanagari Extra"/>
+                <w:color w:val="000000"/>
+                <w:sz w:val="40"/>
+                <w:szCs w:val="40"/>
+              </w:rPr>
+              <w:t xml:space="preserve"> ||</w:t>
+            </w:r>
+          </w:p>
+        </w:tc>
+        <w:tc>
+          <w:tcPr>
+            <w:tcW w:w="5386" w:type="dxa"/>
+          </w:tcPr>
+          <w:p>
+            <w:pPr>
+              <w:spacing w:before="0" w:line="240" w:lineRule="auto"/>
+              <w:rPr>
+                <w:rFonts w:ascii="BRH Malayalam Extra" w:hAnsi="BRH Malayalam Extra" w:cs="BRH Malayalam Extra"/>
+                <w:color w:val="000000"/>
+                <w:sz w:val="40"/>
+                <w:szCs w:val="40"/>
+              </w:rPr>
+            </w:pPr>
+            <w:proofErr w:type="spellStart"/>
+            <w:r>
+              <w:rPr>
+                <w:rFonts w:ascii="BRH Devanagari Extra" w:hAnsi="BRH Devanagari Extra" w:cs="BRH Devanagari Extra"/>
+                <w:color w:val="000000"/>
+                <w:sz w:val="40"/>
+                <w:szCs w:val="40"/>
+              </w:rPr>
+              <w:t>rÉÉå</w:t>
+            </w:r>
+            <w:proofErr w:type="spellEnd"/>
+            <w:r>
+              <w:rPr>
+                <w:rFonts w:ascii="BRH Devanagari Extra" w:hAnsi="BRH Devanagari Extra" w:cs="BRH Devanagari Extra"/>
+                <w:color w:val="000000"/>
+                <w:sz w:val="40"/>
+                <w:szCs w:val="40"/>
+              </w:rPr>
+              <w:t xml:space="preserve"> </w:t>
+            </w:r>
+            <w:proofErr w:type="spellStart"/>
+            <w:r>
+              <w:rPr>
+                <w:rFonts w:ascii="BRH Devanagari Extra" w:hAnsi="BRH Devanagari Extra" w:cs="BRH Devanagari Extra"/>
+                <w:color w:val="000000"/>
+                <w:sz w:val="40"/>
+                <w:szCs w:val="40"/>
+              </w:rPr>
+              <w:t>AÎxiÉþ</w:t>
+            </w:r>
+            <w:proofErr w:type="spellEnd"/>
+            <w:r>
+              <w:rPr>
+                <w:rFonts w:ascii="BRH Devanagari Extra" w:hAnsi="BRH Devanagari Extra" w:cs="BRH Devanagari Extra"/>
+                <w:color w:val="000000"/>
+                <w:sz w:val="40"/>
+                <w:szCs w:val="40"/>
+              </w:rPr>
+              <w:t xml:space="preserve"> | </w:t>
+            </w:r>
+            <w:proofErr w:type="spellStart"/>
+            <w:r>
+              <w:rPr>
+                <w:rFonts w:ascii="BRH Devanagari Extra" w:hAnsi="BRH Devanagari Extra" w:cs="BRH Devanagari Extra"/>
+                <w:color w:val="000000"/>
+                <w:sz w:val="40"/>
+                <w:szCs w:val="40"/>
+              </w:rPr>
+              <w:t>A</w:t>
+            </w:r>
+            <w:r>
+              <w:rPr>
+                <w:rFonts w:ascii="BRH Devanagari Extra" w:hAnsi="BRH Devanagari Extra" w:cs="BRH Devanagari Extra"/>
+                <w:color w:val="000000"/>
+                <w:sz w:val="40"/>
+                <w:szCs w:val="40"/>
+                <w:highlight w:val="green"/>
+              </w:rPr>
+              <w:t>xiÉÏ</w:t>
+            </w:r>
+            <w:r>
+              <w:rPr>
+                <w:rFonts w:ascii="BRH Devanagari Extra" w:hAnsi="BRH Devanagari Extra" w:cs="BRH Devanagari Extra"/>
+                <w:color w:val="000000"/>
+                <w:sz w:val="40"/>
+                <w:szCs w:val="40"/>
+              </w:rPr>
+              <w:t>irÉÎxiÉþ</w:t>
+            </w:r>
+            <w:proofErr w:type="spellEnd"/>
+            <w:r>
+              <w:rPr>
+                <w:rFonts w:ascii="BRH Devanagari Extra" w:hAnsi="BRH Devanagari Extra" w:cs="BRH Devanagari Extra"/>
+                <w:color w:val="000000"/>
+                <w:sz w:val="40"/>
+                <w:szCs w:val="40"/>
+              </w:rPr>
+              <w:t xml:space="preserve"> ||</w:t>
             </w:r>
           </w:p>
         </w:tc>
@@ -262,7 +1328,7 @@
                 <w:sz w:val="28"/>
                 <w:szCs w:val="32"/>
               </w:rPr>
-              <w:t xml:space="preserve">3.5.4.1 </w:t>
+              <w:t xml:space="preserve">3.5.4.2 </w:t>
             </w:r>
             <w:r>
               <w:rPr>
@@ -304,7 +1370,40 @@
                 <w:szCs w:val="32"/>
                 <w:lang w:val="en-IN"/>
               </w:rPr>
-              <w:t>Krama Vaakyam No. - 27</w:t>
+              <w:t xml:space="preserve">Krama Vaakyam No. </w:t>
+            </w:r>
+            <w:r>
+              <w:rPr>
+                <w:rFonts w:cs="Arial"/>
+                <w:b/>
+                <w:color w:val="000000"/>
+                <w:sz w:val="28"/>
+                <w:szCs w:val="32"/>
+                <w:lang w:val="en-IN"/>
+              </w:rPr>
+              <w:t>–</w:t>
+            </w:r>
+            <w:r>
+              <w:rPr>
+                <w:rFonts w:cs="Arial"/>
+                <w:b/>
+                <w:color w:val="000000"/>
+                <w:sz w:val="28"/>
+                <w:szCs w:val="32"/>
+                <w:lang w:val="en-IN"/>
+              </w:rPr>
+              <w:t xml:space="preserve"> </w:t>
+            </w:r>
+            <w:r>
+              <w:rPr>
+                <w:rFonts w:cs="Arial"/>
+                <w:b/>
+                <w:color w:val="000000"/>
+                <w:sz w:val="28"/>
+                <w:szCs w:val="32"/>
+                <w:lang w:val="en-IN"/>
+              </w:rPr>
+              <w:t>50,52</w:t>
             </w:r>
           </w:p>
           <w:p>
@@ -324,29 +1423,39 @@
                 <w:color w:val="000000"/>
                 <w:sz w:val="28"/>
                 <w:szCs w:val="32"/>
+              </w:rPr>
+            </w:pPr>
+            <w:r>
+              <w:rPr>
+                <w:rFonts w:cs="Arial"/>
+                <w:b/>
+                <w:color w:val="000000"/>
+                <w:sz w:val="28"/>
+                <w:szCs w:val="32"/>
                 <w:lang w:val="it-IT"/>
               </w:rPr>
-            </w:pPr>
-            <w:r>
-              <w:rPr>
-                <w:rFonts w:cs="Arial"/>
-                <w:b/>
-                <w:color w:val="000000"/>
-                <w:sz w:val="28"/>
+              <w:t>Panchaati No</w:t>
+            </w:r>
+            <w:r>
+              <w:rPr>
+                <w:rFonts w:cs="Arial"/>
+                <w:b/>
+                <w:color w:val="000000"/>
                 <w:szCs w:val="32"/>
                 <w:lang w:val="it-IT"/>
               </w:rPr>
-              <w:t>Panchaati No</w:t>
-            </w:r>
-            <w:r>
-              <w:rPr>
-                <w:rFonts w:cs="Arial"/>
-                <w:b/>
-                <w:color w:val="000000"/>
+              <w:t xml:space="preserve">. - </w:t>
+            </w:r>
+            <w:r>
+              <w:rPr>
+                <w:rFonts w:cs="Arial"/>
+                <w:b/>
+                <w:color w:val="000000"/>
+                <w:sz w:val="28"/>
                 <w:szCs w:val="32"/>
                 <w:lang w:val="it-IT"/>
               </w:rPr>
-              <w:t xml:space="preserve">. - </w:t>
+              <w:t>1</w:t>
             </w:r>
             <w:r>
               <w:rPr>
@@ -357,24 +1466,13 @@
                 <w:szCs w:val="32"/>
                 <w:lang w:val="it-IT"/>
               </w:rPr>
-              <w:t>1</w:t>
-            </w:r>
-            <w:r>
-              <w:rPr>
-                <w:rFonts w:cs="Arial"/>
-                <w:b/>
-                <w:color w:val="000000"/>
-                <w:sz w:val="28"/>
-                <w:szCs w:val="32"/>
-                <w:lang w:val="it-IT"/>
-              </w:rPr>
-              <w:t>2</w:t>
+              <w:t>3</w:t>
             </w:r>
           </w:p>
         </w:tc>
         <w:tc>
           <w:tcPr>
-            <w:tcW w:w="5103" w:type="dxa"/>
+            <w:tcW w:w="4961" w:type="dxa"/>
           </w:tcPr>
           <w:p>
             <w:pPr>
@@ -384,10 +1482,192 @@
               <w:adjustRightInd w:val="0"/>
               <w:spacing w:before="0" w:line="240" w:lineRule="auto"/>
               <w:rPr>
-                <w:rFonts w:ascii="BRH Malayalam Extra" w:hAnsi="BRH Malayalam Extra" w:cs="BRH Malayalam Extra"/>
-                <w:color w:val="000000"/>
+                <w:rFonts w:ascii="Latha" w:hAnsi="Latha" w:cs="Latha"/>
+                <w:sz w:val="28"/>
+                <w:szCs w:val="28"/>
+                <w:lang w:bidi="ta-IN"/>
+              </w:rPr>
+            </w:pPr>
+            <w:r>
+              <w:rPr>
+                <w:rFonts w:ascii="Latha" w:hAnsi="Latha" w:cs="Latha"/>
+                <w:sz w:val="28"/>
+                <w:szCs w:val="28"/>
+                <w:cs/>
+                <w:lang w:bidi="ta-IN"/>
+              </w:rPr>
+              <w:t>ஸ</w:t>
+            </w:r>
+            <w:r>
+              <w:rPr>
+                <w:rFonts w:ascii="BRH Tamil Tab Extra" w:hAnsi="BRH Tamil Tab Extra" w:cs="Latha"/>
+                <w:b/>
                 <w:sz w:val="36"/>
-                <w:szCs w:val="40"/>
+                <w:szCs w:val="28"/>
+                <w:lang w:bidi="ta-IN"/>
+              </w:rPr>
+              <w:t>…</w:t>
+            </w:r>
+            <w:r>
+              <w:rPr>
+                <w:rFonts w:ascii="Latha" w:hAnsi="Latha" w:cs="Latha"/>
+                <w:sz w:val="28"/>
+                <w:szCs w:val="28"/>
+                <w:cs/>
+                <w:lang w:bidi="ta-IN"/>
+              </w:rPr>
+              <w:t>ஜா</w:t>
+            </w:r>
+            <w:r>
+              <w:rPr>
+                <w:rFonts w:ascii="BRH Tamil Tab Extra" w:hAnsi="BRH Tamil Tab Extra" w:cs="Latha"/>
+                <w:b/>
+                <w:sz w:val="36"/>
+                <w:szCs w:val="28"/>
+                <w:lang w:bidi="ta-IN"/>
+              </w:rPr>
+              <w:t>…</w:t>
+            </w:r>
+            <w:r>
+              <w:rPr>
+                <w:rFonts w:ascii="Latha" w:hAnsi="Latha" w:cs="Latha"/>
+                <w:sz w:val="28"/>
+                <w:szCs w:val="28"/>
+                <w:cs/>
+                <w:lang w:bidi="ta-IN"/>
+              </w:rPr>
+              <w:t>தானா</w:t>
+            </w:r>
+            <w:r>
+              <w:rPr>
+                <w:rFonts w:ascii="BRH Tamil Tab Extra" w:hAnsi="BRH Tamil Tab Extra" w:cs="Latha"/>
+                <w:b/>
+                <w:sz w:val="36"/>
+                <w:szCs w:val="28"/>
+                <w:lang w:bidi="ta-IN"/>
+              </w:rPr>
+              <w:t>…</w:t>
+            </w:r>
+            <w:r>
+              <w:rPr>
+                <w:rFonts w:ascii="BRH Devanagari Extra" w:hAnsi="BRH Devanagari Extra" w:cs="Latha"/>
+                <w:b/>
+                <w:sz w:val="36"/>
+                <w:szCs w:val="28"/>
+                <w:lang w:bidi="ta-IN"/>
+              </w:rPr>
+              <w:t>ò</w:t>
+            </w:r>
+            <w:r>
+              <w:rPr>
+                <w:rFonts w:ascii="BRH Tamil Tab Extra" w:hAnsi="BRH Tamil Tab Extra" w:cs="Latha"/>
+                <w:b/>
+                <w:sz w:val="36"/>
+                <w:szCs w:val="28"/>
+                <w:lang w:bidi="ta-IN"/>
+              </w:rPr>
+              <w:t>…</w:t>
+            </w:r>
+            <w:r>
+              <w:rPr>
+                <w:rFonts w:ascii="Latha" w:hAnsi="Latha" w:cs="Latha"/>
+                <w:sz w:val="28"/>
+                <w:szCs w:val="28"/>
+                <w:lang w:bidi="ta-IN"/>
+              </w:rPr>
+              <w:t xml:space="preserve"> </w:t>
+            </w:r>
+            <w:r>
+              <w:rPr>
+                <w:rFonts w:ascii="Latha" w:hAnsi="Latha" w:cs="Latha"/>
+                <w:sz w:val="28"/>
+                <w:szCs w:val="28"/>
+                <w:cs/>
+                <w:lang w:bidi="ta-IN"/>
+              </w:rPr>
+              <w:t>ஶ்ரை</w:t>
+            </w:r>
+            <w:r>
+              <w:rPr>
+                <w:rFonts w:ascii="Latha" w:hAnsi="Latha" w:cs="Latha"/>
+                <w:sz w:val="28"/>
+                <w:szCs w:val="28"/>
+                <w:highlight w:val="yellow"/>
+                <w:cs/>
+                <w:lang w:bidi="ta-IN"/>
+              </w:rPr>
+              <w:t>ஷ்</w:t>
+            </w:r>
+            <w:r>
+              <w:rPr>
+                <w:rFonts w:ascii="Latha" w:hAnsi="Latha" w:cs="Latha" w:hint="cs"/>
+                <w:sz w:val="28"/>
+                <w:szCs w:val="28"/>
+                <w:highlight w:val="yellow"/>
+                <w:cs/>
+                <w:lang w:bidi="ta-IN"/>
+              </w:rPr>
+              <w:t>டே</w:t>
+            </w:r>
+            <w:r>
+              <w:rPr>
+                <w:rFonts w:ascii="BRH Tamil Tab Extra" w:hAnsi="BRH Tamil Tab Extra" w:cs="Latha"/>
+                <w:b/>
+                <w:sz w:val="36"/>
+                <w:szCs w:val="28"/>
+                <w:highlight w:val="yellow"/>
+                <w:lang w:bidi="ta-IN"/>
+              </w:rPr>
+              <w:t>‡</w:t>
+            </w:r>
+            <w:r>
+              <w:rPr>
+                <w:rFonts w:ascii="Latha" w:hAnsi="Latha" w:cs="Latha"/>
+                <w:b/>
+                <w:bCs/>
+                <w:position w:val="-12"/>
+                <w:sz w:val="28"/>
+                <w:szCs w:val="28"/>
+                <w:highlight w:val="yellow"/>
+                <w:cs/>
+                <w:lang w:bidi="ta-IN"/>
+              </w:rPr>
+              <w:t>2</w:t>
+            </w:r>
+            <w:r>
+              <w:rPr>
+                <w:rFonts w:ascii="Latha" w:hAnsi="Latha" w:cs="Latha"/>
+                <w:sz w:val="28"/>
+                <w:szCs w:val="28"/>
+                <w:highlight w:val="yellow"/>
+                <w:cs/>
+                <w:lang w:bidi="ta-IN"/>
+              </w:rPr>
+              <w:t>‍</w:t>
+            </w:r>
+            <w:r>
+              <w:rPr>
+                <w:rFonts w:ascii="Latha" w:hAnsi="Latha" w:cs="Latha"/>
+                <w:sz w:val="28"/>
+                <w:szCs w:val="28"/>
+                <w:highlight w:val="yellow"/>
+                <w:lang w:bidi="ta-IN"/>
+              </w:rPr>
+              <w:t xml:space="preserve"> |</w:t>
+            </w:r>
+          </w:p>
+          <w:p>
+            <w:pPr>
+              <w:widowControl w:val="0"/>
+              <w:autoSpaceDE w:val="0"/>
+              <w:autoSpaceDN w:val="0"/>
+              <w:adjustRightInd w:val="0"/>
+              <w:spacing w:before="0" w:line="240" w:lineRule="auto"/>
+              <w:rPr>
+                <w:rFonts w:cs="Arial"/>
+                <w:sz w:val="28"/>
+                <w:szCs w:val="28"/>
+                <w:lang w:bidi="ta-IN"/>
               </w:rPr>
             </w:pPr>
             <w:r>
@@ -397,18 +1677,255 @@
                 <w:sz w:val="40"/>
                 <w:szCs w:val="40"/>
               </w:rPr>
-              <w:t>rÉÉå AÎxiÉþ | A</w:t>
-            </w:r>
-            <w:r>
-              <w:rPr>
-                <w:rFonts w:ascii="BRH Devanagari Extra" w:hAnsi="BRH Devanagari Extra" w:cs="BRH Devanagari Extra"/>
-                <w:color w:val="000000"/>
-                <w:sz w:val="40"/>
-                <w:szCs w:val="40"/>
+              <w:t>xÉ</w:t>
+            </w:r>
+            <w:r>
+              <w:rPr>
+                <w:rFonts w:ascii="BRH Malayalam Extra" w:hAnsi="BRH Malayalam Extra" w:cs="BRH Devanagari Extra"/>
+                <w:b/>
+                <w:color w:val="000000"/>
+                <w:sz w:val="32"/>
+                <w:szCs w:val="40"/>
+              </w:rPr>
+              <w:t>–</w:t>
+            </w:r>
+            <w:r>
+              <w:rPr>
+                <w:rFonts w:ascii="BRH Devanagari Extra" w:hAnsi="BRH Devanagari Extra" w:cs="BRH Devanagari Extra"/>
+                <w:color w:val="000000"/>
+                <w:sz w:val="40"/>
+                <w:szCs w:val="40"/>
+              </w:rPr>
+              <w:t>eÉÉ</w:t>
+            </w:r>
+            <w:r>
+              <w:rPr>
+                <w:rFonts w:ascii="BRH Malayalam Extra" w:hAnsi="BRH Malayalam Extra" w:cs="BRH Devanagari Extra"/>
+                <w:b/>
+                <w:color w:val="000000"/>
+                <w:sz w:val="32"/>
+                <w:szCs w:val="40"/>
+              </w:rPr>
+              <w:t>–</w:t>
+            </w:r>
+            <w:proofErr w:type="spellStart"/>
+            <w:r>
+              <w:rPr>
+                <w:rFonts w:ascii="BRH Devanagari Extra" w:hAnsi="BRH Devanagari Extra" w:cs="BRH Devanagari Extra"/>
+                <w:color w:val="000000"/>
+                <w:sz w:val="40"/>
+                <w:szCs w:val="40"/>
+              </w:rPr>
+              <w:t>iÉÉlÉÉ</w:t>
+            </w:r>
+            <w:proofErr w:type="spellEnd"/>
+            <w:r>
+              <w:rPr>
+                <w:rFonts w:ascii="BRH Malayalam Extra" w:hAnsi="BRH Malayalam Extra" w:cs="BRH Devanagari Extra"/>
+                <w:b/>
+                <w:color w:val="000000"/>
+                <w:sz w:val="32"/>
+                <w:szCs w:val="40"/>
+              </w:rPr>
+              <w:t>–</w:t>
+            </w:r>
+            <w:r>
+              <w:rPr>
+                <w:rFonts w:ascii="BRH Devanagari Extra" w:hAnsi="BRH Devanagari Extra" w:cs="BRH Devanagari Extra"/>
+                <w:color w:val="000000"/>
+                <w:sz w:val="36"/>
+                <w:szCs w:val="40"/>
+              </w:rPr>
+              <w:t>ò</w:t>
+            </w:r>
+            <w:r>
+              <w:rPr>
+                <w:rFonts w:ascii="BRH Malayalam Extra" w:hAnsi="BRH Malayalam Extra" w:cs="BRH Devanagari Extra"/>
+                <w:b/>
+                <w:color w:val="000000"/>
+                <w:sz w:val="32"/>
+                <w:szCs w:val="40"/>
+              </w:rPr>
+              <w:t>–</w:t>
+            </w:r>
+            <w:r>
+              <w:rPr>
+                <w:rFonts w:ascii="BRH Devanagari Extra" w:hAnsi="BRH Devanagari Extra" w:cs="BRH Devanagari Extra"/>
+                <w:color w:val="000000"/>
+                <w:sz w:val="40"/>
+                <w:szCs w:val="40"/>
+              </w:rPr>
+              <w:t xml:space="preserve"> ´</w:t>
+            </w:r>
+            <w:proofErr w:type="spellStart"/>
+            <w:r>
+              <w:rPr>
+                <w:rFonts w:ascii="BRH Devanagari Extra" w:hAnsi="BRH Devanagari Extra" w:cs="BRH Devanagari Extra"/>
+                <w:color w:val="000000"/>
+                <w:sz w:val="40"/>
+                <w:szCs w:val="40"/>
+              </w:rPr>
+              <w:t>ÉæwPèrÉåÿ</w:t>
+            </w:r>
+            <w:proofErr w:type="spellEnd"/>
+            <w:r>
+              <w:rPr>
+                <w:rFonts w:ascii="BRH Devanagari Extra" w:hAnsi="BRH Devanagari Extra" w:cs="BRH Devanagari Extra"/>
+                <w:color w:val="000000"/>
+                <w:sz w:val="40"/>
+                <w:szCs w:val="40"/>
+              </w:rPr>
+              <w:t xml:space="preserve"> |</w:t>
+            </w:r>
+            <w:r>
+              <w:rPr>
+                <w:rFonts w:ascii="BRH Devanagari Extra" w:hAnsi="BRH Devanagari Extra" w:cs="BRH Devanagari Extra"/>
+                <w:color w:val="000000"/>
+                <w:sz w:val="40"/>
+                <w:szCs w:val="40"/>
+              </w:rPr>
+              <w:t xml:space="preserve"> </w:t>
+            </w:r>
+            <w:r>
+              <w:rPr>
+                <w:rFonts w:cs="Arial"/>
+                <w:color w:val="000000"/>
+                <w:sz w:val="28"/>
+                <w:szCs w:val="28"/>
+              </w:rPr>
+              <w:t>correct</w:t>
+            </w:r>
+            <w:r>
+              <w:rPr>
+                <w:rFonts w:cs="Arial"/>
+                <w:color w:val="000000"/>
+                <w:sz w:val="28"/>
+                <w:szCs w:val="28"/>
+              </w:rPr>
+              <w:t xml:space="preserve"> in </w:t>
+            </w:r>
+            <w:proofErr w:type="spellStart"/>
+            <w:r>
+              <w:rPr>
+                <w:rFonts w:cs="Arial"/>
+                <w:color w:val="000000"/>
+                <w:sz w:val="28"/>
+                <w:szCs w:val="28"/>
+              </w:rPr>
+              <w:t>sanskrit</w:t>
+            </w:r>
+            <w:proofErr w:type="spellEnd"/>
+          </w:p>
+          <w:p>
+            <w:pPr>
+              <w:widowControl w:val="0"/>
+              <w:autoSpaceDE w:val="0"/>
+              <w:autoSpaceDN w:val="0"/>
+              <w:adjustRightInd w:val="0"/>
+              <w:spacing w:before="0" w:line="240" w:lineRule="auto"/>
+              <w:rPr>
+                <w:rFonts w:ascii="Latha" w:hAnsi="Latha" w:cs="Latha"/>
+                <w:sz w:val="28"/>
+                <w:szCs w:val="28"/>
+                <w:cs/>
+                <w:lang w:bidi="ta-IN"/>
+              </w:rPr>
+            </w:pPr>
+            <w:r>
+              <w:rPr>
+                <w:rFonts w:ascii="Latha" w:hAnsi="Latha" w:cs="Latha"/>
+                <w:sz w:val="28"/>
+                <w:szCs w:val="28"/>
                 <w:highlight w:val="yellow"/>
-              </w:rPr>
-              <w:t>xiÉÏ</w:t>
-            </w:r>
+                <w:cs/>
+                <w:lang w:bidi="ta-IN"/>
+              </w:rPr>
+              <w:t>ஶ்ரேஷ்ட</w:t>
+            </w:r>
+            <w:r>
+              <w:rPr>
+                <w:rFonts w:ascii="BRH Tamil Tab Extra" w:hAnsi="BRH Tamil Tab Extra" w:cs="Latha"/>
+                <w:b/>
+                <w:sz w:val="36"/>
+                <w:szCs w:val="28"/>
+                <w:highlight w:val="yellow"/>
+                <w:lang w:bidi="ta-IN"/>
+              </w:rPr>
+              <w:t>…</w:t>
+            </w:r>
+            <w:r>
+              <w:rPr>
+                <w:rFonts w:ascii="Latha" w:hAnsi="Latha" w:cs="Latha"/>
+                <w:b/>
+                <w:bCs/>
+                <w:position w:val="-12"/>
+                <w:sz w:val="28"/>
+                <w:szCs w:val="28"/>
+                <w:highlight w:val="yellow"/>
+                <w:cs/>
+                <w:lang w:bidi="ta-IN"/>
+              </w:rPr>
+              <w:t>2</w:t>
+            </w:r>
+            <w:r>
+              <w:rPr>
+                <w:rFonts w:ascii="Latha" w:hAnsi="Latha" w:cs="Latha"/>
+                <w:sz w:val="28"/>
+                <w:szCs w:val="28"/>
+                <w:highlight w:val="yellow"/>
+                <w:cs/>
+                <w:lang w:bidi="ta-IN"/>
+              </w:rPr>
+              <w:t>‍</w:t>
+            </w:r>
+            <w:r>
+              <w:rPr>
+                <w:rFonts w:ascii="Latha" w:hAnsi="Latha" w:cs="Latha"/>
+                <w:sz w:val="28"/>
+                <w:szCs w:val="28"/>
+                <w:lang w:bidi="ta-IN"/>
+              </w:rPr>
+              <w:t xml:space="preserve"> </w:t>
+            </w:r>
+            <w:r>
+              <w:rPr>
+                <w:rFonts w:ascii="Latha" w:hAnsi="Latha" w:cs="Latha"/>
+                <w:sz w:val="28"/>
+                <w:szCs w:val="28"/>
+                <w:cs/>
+                <w:lang w:bidi="ta-IN"/>
+              </w:rPr>
+              <w:t>ஆ</w:t>
+            </w:r>
+            <w:r>
+              <w:rPr>
+                <w:rFonts w:ascii="Latha" w:hAnsi="Latha" w:cs="Latha"/>
+                <w:sz w:val="28"/>
+                <w:szCs w:val="28"/>
+                <w:lang w:bidi="ta-IN"/>
+              </w:rPr>
+              <w:t xml:space="preserve"> |</w:t>
+            </w:r>
+            <w:r>
+              <w:rPr>
+                <w:rFonts w:ascii="BRH Devanagari Extra" w:hAnsi="BRH Devanagari Extra" w:cs="BRH Devanagari Extra"/>
+                <w:color w:val="000000"/>
+                <w:sz w:val="40"/>
+                <w:szCs w:val="40"/>
+              </w:rPr>
+              <w:t xml:space="preserve"> ´</w:t>
+            </w:r>
+            <w:proofErr w:type="spellStart"/>
+            <w:r>
+              <w:rPr>
+                <w:rFonts w:ascii="BRH Devanagari Extra" w:hAnsi="BRH Devanagari Extra" w:cs="BRH Devanagari Extra"/>
+                <w:color w:val="000000"/>
+                <w:sz w:val="40"/>
+                <w:szCs w:val="40"/>
+              </w:rPr>
+              <w:t>ÉåwPèrÉ</w:t>
+            </w:r>
+            <w:proofErr w:type="spellEnd"/>
             <w:r>
               <w:rPr>
                 <w:rFonts w:ascii="BRH Malayalam Extra" w:hAnsi="BRH Malayalam Extra" w:cs="BRH Devanagari Extra"/>
@@ -426,57 +1943,388 @@
                 <w:sz w:val="40"/>
                 <w:szCs w:val="40"/>
               </w:rPr>
-              <w:t>irÉÎxiÉþ ||</w:t>
+              <w:t xml:space="preserve"> AÉ |</w:t>
             </w:r>
           </w:p>
         </w:tc>
         <w:tc>
           <w:tcPr>
-            <w:tcW w:w="5386" w:type="dxa"/>
+            <w:tcW w:w="5670" w:type="dxa"/>
+            <w:gridSpan w:val="3"/>
           </w:tcPr>
           <w:p>
             <w:pPr>
               <w:spacing w:before="0" w:line="240" w:lineRule="auto"/>
               <w:rPr>
-                <w:rFonts w:ascii="BRH Malayalam Extra" w:hAnsi="BRH Malayalam Extra" w:cs="BRH Malayalam Extra"/>
-                <w:color w:val="000000"/>
-                <w:sz w:val="40"/>
-                <w:szCs w:val="40"/>
+                <w:rFonts w:ascii="Latha" w:hAnsi="Latha" w:cs="Latha"/>
+                <w:sz w:val="28"/>
+                <w:szCs w:val="28"/>
+                <w:lang w:bidi="ta-IN"/>
               </w:rPr>
             </w:pPr>
             <w:r>
               <w:rPr>
-                <w:rFonts w:ascii="BRH Devanagari Extra" w:hAnsi="BRH Devanagari Extra" w:cs="BRH Devanagari Extra"/>
-                <w:color w:val="000000"/>
-                <w:sz w:val="40"/>
-                <w:szCs w:val="40"/>
-              </w:rPr>
-              <w:t>rÉÉå AÎxiÉþ | A</w:t>
-            </w:r>
-            <w:r>
-              <w:rPr>
-                <w:rFonts w:ascii="BRH Devanagari Extra" w:hAnsi="BRH Devanagari Extra" w:cs="BRH Devanagari Extra"/>
-                <w:color w:val="000000"/>
-                <w:sz w:val="40"/>
-                <w:szCs w:val="40"/>
+                <w:rFonts w:ascii="Latha" w:hAnsi="Latha" w:cs="Latha"/>
+                <w:sz w:val="28"/>
+                <w:szCs w:val="28"/>
+                <w:cs/>
+                <w:lang w:bidi="ta-IN"/>
+              </w:rPr>
+              <w:t>ஸ</w:t>
+            </w:r>
+            <w:r>
+              <w:rPr>
+                <w:rFonts w:ascii="BRH Tamil Tab Extra" w:hAnsi="BRH Tamil Tab Extra" w:cs="Latha"/>
+                <w:b/>
+                <w:sz w:val="36"/>
+                <w:szCs w:val="28"/>
+                <w:lang w:bidi="ta-IN"/>
+              </w:rPr>
+              <w:t>…</w:t>
+            </w:r>
+            <w:r>
+              <w:rPr>
+                <w:rFonts w:ascii="Latha" w:hAnsi="Latha" w:cs="Latha"/>
+                <w:sz w:val="28"/>
+                <w:szCs w:val="28"/>
+                <w:cs/>
+                <w:lang w:bidi="ta-IN"/>
+              </w:rPr>
+              <w:t>ஜா</w:t>
+            </w:r>
+            <w:r>
+              <w:rPr>
+                <w:rFonts w:ascii="BRH Tamil Tab Extra" w:hAnsi="BRH Tamil Tab Extra" w:cs="Latha"/>
+                <w:b/>
+                <w:sz w:val="36"/>
+                <w:szCs w:val="28"/>
+                <w:lang w:bidi="ta-IN"/>
+              </w:rPr>
+              <w:t>…</w:t>
+            </w:r>
+            <w:r>
+              <w:rPr>
+                <w:rFonts w:ascii="Latha" w:hAnsi="Latha" w:cs="Latha"/>
+                <w:sz w:val="28"/>
+                <w:szCs w:val="28"/>
+                <w:cs/>
+                <w:lang w:bidi="ta-IN"/>
+              </w:rPr>
+              <w:t>தானா</w:t>
+            </w:r>
+            <w:r>
+              <w:rPr>
+                <w:rFonts w:ascii="BRH Tamil Tab Extra" w:hAnsi="BRH Tamil Tab Extra" w:cs="Latha"/>
+                <w:b/>
+                <w:sz w:val="36"/>
+                <w:szCs w:val="28"/>
+                <w:lang w:bidi="ta-IN"/>
+              </w:rPr>
+              <w:t>…</w:t>
+            </w:r>
+            <w:r>
+              <w:rPr>
+                <w:rFonts w:ascii="BRH Devanagari Extra" w:hAnsi="BRH Devanagari Extra" w:cs="Latha"/>
+                <w:b/>
+                <w:sz w:val="36"/>
+                <w:szCs w:val="28"/>
+                <w:lang w:bidi="ta-IN"/>
+              </w:rPr>
+              <w:t>ò</w:t>
+            </w:r>
+            <w:r>
+              <w:rPr>
+                <w:rFonts w:ascii="BRH Tamil Tab Extra" w:hAnsi="BRH Tamil Tab Extra" w:cs="Latha"/>
+                <w:b/>
+                <w:sz w:val="36"/>
+                <w:szCs w:val="28"/>
+                <w:lang w:bidi="ta-IN"/>
+              </w:rPr>
+              <w:t>…</w:t>
+            </w:r>
+            <w:r>
+              <w:rPr>
+                <w:rFonts w:ascii="Latha" w:hAnsi="Latha" w:cs="Latha"/>
+                <w:sz w:val="28"/>
+                <w:szCs w:val="28"/>
+                <w:lang w:bidi="ta-IN"/>
+              </w:rPr>
+              <w:t xml:space="preserve"> </w:t>
+            </w:r>
+            <w:r>
+              <w:rPr>
+                <w:rFonts w:ascii="Latha" w:hAnsi="Latha" w:cs="Latha"/>
+                <w:sz w:val="28"/>
+                <w:szCs w:val="28"/>
+                <w:cs/>
+                <w:lang w:bidi="ta-IN"/>
+              </w:rPr>
+              <w:t>ஶ்ரை</w:t>
+            </w:r>
+            <w:r>
+              <w:rPr>
+                <w:rFonts w:ascii="Latha" w:hAnsi="Latha" w:cs="Latha"/>
+                <w:sz w:val="28"/>
+                <w:szCs w:val="28"/>
                 <w:highlight w:val="green"/>
-              </w:rPr>
-              <w:t>xiÉÏ</w:t>
-            </w:r>
-            <w:r>
-              <w:rPr>
-                <w:rFonts w:ascii="BRH Devanagari Extra" w:hAnsi="BRH Devanagari Extra" w:cs="BRH Devanagari Extra"/>
-                <w:color w:val="000000"/>
-                <w:sz w:val="40"/>
-                <w:szCs w:val="40"/>
-              </w:rPr>
-              <w:t>irÉÎxiÉþ ||</w:t>
+                <w:cs/>
+                <w:lang w:bidi="ta-IN"/>
+              </w:rPr>
+              <w:t>ஷ்</w:t>
+            </w:r>
+            <w:r>
+              <w:rPr>
+                <w:rFonts w:ascii="Latha" w:hAnsi="Latha" w:cs="Latha" w:hint="cs"/>
+                <w:sz w:val="28"/>
+                <w:szCs w:val="28"/>
+                <w:highlight w:val="green"/>
+                <w:cs/>
+                <w:lang w:bidi="ta-IN"/>
+              </w:rPr>
+              <w:t>ட்</w:t>
+            </w:r>
+            <w:r>
+              <w:rPr>
+                <w:rFonts w:ascii="Latha" w:hAnsi="Latha" w:cs="Latha"/>
+                <w:b/>
+                <w:bCs/>
+                <w:position w:val="-12"/>
+                <w:sz w:val="28"/>
+                <w:szCs w:val="28"/>
+                <w:highlight w:val="green"/>
+                <w:cs/>
+                <w:lang w:bidi="ta-IN"/>
+              </w:rPr>
+              <w:t>2</w:t>
+            </w:r>
+            <w:r>
+              <w:rPr>
+                <w:rFonts w:ascii="Latha" w:hAnsi="Latha" w:cs="Latha"/>
+                <w:sz w:val="28"/>
+                <w:szCs w:val="28"/>
+                <w:highlight w:val="green"/>
+                <w:cs/>
+                <w:lang w:bidi="ta-IN"/>
+              </w:rPr>
+              <w:t>‍</w:t>
+            </w:r>
+            <w:r>
+              <w:rPr>
+                <w:rFonts w:ascii="Latha" w:hAnsi="Latha" w:cs="Latha" w:hint="cs"/>
+                <w:sz w:val="28"/>
+                <w:szCs w:val="28"/>
+                <w:highlight w:val="green"/>
+                <w:cs/>
+                <w:lang w:bidi="ta-IN"/>
+              </w:rPr>
+              <w:t>யே</w:t>
+            </w:r>
+            <w:r>
+              <w:rPr>
+                <w:rFonts w:ascii="BRH Tamil Tab Extra" w:hAnsi="BRH Tamil Tab Extra" w:cs="Latha"/>
+                <w:b/>
+                <w:sz w:val="36"/>
+                <w:szCs w:val="28"/>
+                <w:highlight w:val="green"/>
+                <w:lang w:bidi="ta-IN"/>
+              </w:rPr>
+              <w:t>‡</w:t>
+            </w:r>
+            <w:r>
+              <w:rPr>
+                <w:rFonts w:ascii="Latha" w:hAnsi="Latha" w:cs="Latha"/>
+                <w:sz w:val="28"/>
+                <w:szCs w:val="28"/>
+                <w:highlight w:val="green"/>
+                <w:lang w:bidi="ta-IN"/>
+              </w:rPr>
+              <w:t xml:space="preserve"> |</w:t>
+            </w:r>
+          </w:p>
+          <w:p>
+            <w:pPr>
+              <w:spacing w:before="0" w:line="240" w:lineRule="auto"/>
+              <w:rPr>
+                <w:rFonts w:ascii="Latha" w:hAnsi="Latha" w:cs="Latha"/>
+                <w:sz w:val="28"/>
+                <w:szCs w:val="28"/>
+                <w:lang w:bidi="ta-IN"/>
+              </w:rPr>
+            </w:pPr>
+          </w:p>
+          <w:p>
+            <w:pPr>
+              <w:spacing w:before="0" w:line="240" w:lineRule="auto"/>
+              <w:rPr>
+                <w:rFonts w:ascii="Latha" w:hAnsi="Latha" w:cs="Latha"/>
+                <w:sz w:val="28"/>
+                <w:szCs w:val="28"/>
+                <w:lang w:bidi="ta-IN"/>
+              </w:rPr>
+            </w:pPr>
+          </w:p>
+          <w:p>
+            <w:pPr>
+              <w:spacing w:before="0" w:line="240" w:lineRule="auto"/>
+              <w:rPr>
+                <w:rFonts w:ascii="Latha" w:hAnsi="Latha" w:cs="Latha"/>
+                <w:sz w:val="28"/>
+                <w:szCs w:val="28"/>
+                <w:cs/>
+                <w:lang w:bidi="ta-IN"/>
+              </w:rPr>
+            </w:pPr>
+            <w:r>
+              <w:rPr>
+                <w:rFonts w:ascii="Latha" w:hAnsi="Latha" w:cs="Latha"/>
+                <w:sz w:val="28"/>
+                <w:szCs w:val="28"/>
+                <w:cs/>
+                <w:lang w:bidi="ta-IN"/>
+              </w:rPr>
+              <w:t>ஶ்</w:t>
+            </w:r>
+            <w:r>
+              <w:rPr>
+                <w:rFonts w:ascii="Latha" w:hAnsi="Latha" w:cs="Latha"/>
+                <w:sz w:val="28"/>
+                <w:szCs w:val="28"/>
+                <w:highlight w:val="green"/>
+                <w:cs/>
+                <w:lang w:bidi="ta-IN"/>
+              </w:rPr>
+              <w:t>ரைஷ்ட்</w:t>
+            </w:r>
+            <w:r>
+              <w:rPr>
+                <w:rFonts w:ascii="Latha" w:hAnsi="Latha" w:cs="Latha"/>
+                <w:b/>
+                <w:bCs/>
+                <w:position w:val="-12"/>
+                <w:sz w:val="28"/>
+                <w:szCs w:val="28"/>
+                <w:highlight w:val="green"/>
+                <w:cs/>
+                <w:lang w:bidi="ta-IN"/>
+              </w:rPr>
+              <w:t>2</w:t>
+            </w:r>
+            <w:r>
+              <w:rPr>
+                <w:rFonts w:ascii="Latha" w:hAnsi="Latha" w:cs="Latha"/>
+                <w:sz w:val="28"/>
+                <w:szCs w:val="28"/>
+                <w:highlight w:val="green"/>
+                <w:cs/>
+                <w:lang w:bidi="ta-IN"/>
+              </w:rPr>
+              <w:t>‌ய</w:t>
+            </w:r>
+            <w:r>
+              <w:rPr>
+                <w:rFonts w:ascii="BRH Tamil Tab Extra" w:hAnsi="BRH Tamil Tab Extra" w:cs="Latha"/>
+                <w:b/>
+                <w:sz w:val="36"/>
+                <w:szCs w:val="28"/>
+                <w:highlight w:val="green"/>
+              </w:rPr>
+              <w:t>…</w:t>
+            </w:r>
+            <w:r>
+              <w:rPr>
+                <w:rFonts w:ascii="Latha" w:hAnsi="Latha" w:cs="Latha"/>
+                <w:sz w:val="28"/>
+                <w:szCs w:val="28"/>
+                <w:highlight w:val="green"/>
+              </w:rPr>
+              <w:t xml:space="preserve"> </w:t>
+            </w:r>
+            <w:r>
+              <w:rPr>
+                <w:rFonts w:ascii="Latha" w:hAnsi="Latha" w:cs="Latha"/>
+                <w:sz w:val="28"/>
+                <w:szCs w:val="28"/>
+                <w:highlight w:val="green"/>
+                <w:cs/>
+                <w:lang w:bidi="ta-IN"/>
+              </w:rPr>
+              <w:t>ஆ</w:t>
+            </w:r>
+            <w:r>
+              <w:rPr>
+                <w:rFonts w:ascii="Latha" w:hAnsi="Latha" w:cs="Latha"/>
+                <w:sz w:val="28"/>
+                <w:szCs w:val="28"/>
+                <w:lang w:bidi="ta-IN"/>
+              </w:rPr>
+              <w:t>/</w:t>
+            </w:r>
+            <w:r>
+              <w:rPr>
+                <w:rFonts w:ascii="BRH Devanagari Extra" w:hAnsi="BRH Devanagari Extra" w:cs="BRH Devanagari Extra"/>
+                <w:color w:val="000000"/>
+                <w:sz w:val="40"/>
+                <w:szCs w:val="40"/>
+              </w:rPr>
+              <w:t xml:space="preserve"> </w:t>
+            </w:r>
+            <w:r>
+              <w:rPr>
+                <w:rFonts w:ascii="BRH Devanagari Extra" w:hAnsi="BRH Devanagari Extra" w:cs="BRH Devanagari Extra"/>
+                <w:color w:val="EE0000"/>
+                <w:sz w:val="40"/>
+                <w:szCs w:val="40"/>
+                <w:highlight w:val="yellow"/>
+              </w:rPr>
+              <w:t>´</w:t>
+            </w:r>
+            <w:proofErr w:type="spellStart"/>
+            <w:r>
+              <w:rPr>
+                <w:rFonts w:ascii="BRH Devanagari Extra" w:hAnsi="BRH Devanagari Extra" w:cs="BRH Devanagari Extra"/>
+                <w:color w:val="EE0000"/>
+                <w:sz w:val="40"/>
+                <w:szCs w:val="40"/>
+                <w:highlight w:val="yellow"/>
+              </w:rPr>
+              <w:t>É</w:t>
+            </w:r>
+            <w:r>
+              <w:rPr>
+                <w:rFonts w:ascii="BRH Devanagari Extra" w:hAnsi="BRH Devanagari Extra" w:cs="BRH Devanagari Extra"/>
+                <w:color w:val="000000"/>
+                <w:sz w:val="40"/>
+                <w:szCs w:val="40"/>
+              </w:rPr>
+              <w:t>åwPèrÉ</w:t>
+            </w:r>
+            <w:proofErr w:type="spellEnd"/>
+            <w:r>
+              <w:rPr>
+                <w:rFonts w:ascii="BRH Malayalam Extra" w:hAnsi="BRH Malayalam Extra" w:cs="BRH Devanagari Extra"/>
+                <w:b/>
+                <w:color w:val="000000"/>
+                <w:sz w:val="32"/>
+                <w:szCs w:val="40"/>
+              </w:rPr>
+              <w:t>–</w:t>
+            </w:r>
+            <w:r>
+              <w:rPr>
+                <w:rFonts w:ascii="BRH Devanagari Extra" w:hAnsi="BRH Devanagari Extra" w:cs="BRH Devanagari Extra"/>
+                <w:color w:val="000000"/>
+                <w:sz w:val="40"/>
+                <w:szCs w:val="40"/>
+              </w:rPr>
+              <w:t xml:space="preserve"> AÉ |</w:t>
             </w:r>
           </w:p>
         </w:tc>
       </w:tr>
       <w:tr>
         <w:trPr>
+          <w:gridAfter w:val="1"/>
+          <w:wAfter w:w="142" w:type="dxa"/>
           <w:trHeight w:val="1118"/>
         </w:trPr>
         <w:tc>
@@ -520,27 +2368,7 @@
                 <w:sz w:val="28"/>
                 <w:szCs w:val="32"/>
               </w:rPr>
-              <w:t>3.5</w:t>
-            </w:r>
-            <w:r>
-              <w:rPr>
-                <w:rFonts w:cs="Arial"/>
-                <w:b/>
-                <w:color w:val="000000"/>
-                <w:sz w:val="28"/>
-                <w:szCs w:val="32"/>
-              </w:rPr>
-              <w:t>.7.3</w:t>
-            </w:r>
-            <w:r>
-              <w:rPr>
-                <w:rFonts w:cs="Arial"/>
-                <w:b/>
-                <w:color w:val="000000"/>
-                <w:sz w:val="28"/>
-                <w:szCs w:val="32"/>
-              </w:rPr>
-              <w:t xml:space="preserve"> </w:t>
+              <w:t xml:space="preserve">3.5.7.3 </w:t>
             </w:r>
             <w:r>
               <w:rPr>
@@ -582,18 +2410,7 @@
                 <w:szCs w:val="32"/>
                 <w:lang w:val="it-IT"/>
               </w:rPr>
-              <w:t xml:space="preserve">Krama Vaakyam No. - </w:t>
-            </w:r>
-            <w:r>
-              <w:rPr>
-                <w:rFonts w:cs="Arial"/>
-                <w:b/>
-                <w:color w:val="000000"/>
-                <w:sz w:val="28"/>
-                <w:szCs w:val="32"/>
-                <w:lang w:val="it-IT"/>
-              </w:rPr>
-              <w:t>44</w:t>
+              <w:t>Krama Vaakyam No. - 44</w:t>
             </w:r>
           </w:p>
           <w:p>
@@ -653,6 +2470,7 @@
         <w:tc>
           <w:tcPr>
             <w:tcW w:w="5103" w:type="dxa"/>
+            <w:gridSpan w:val="2"/>
           </w:tcPr>
           <w:p>
             <w:pPr>
@@ -668,15 +2486,37 @@
                 <w:szCs w:val="40"/>
               </w:rPr>
             </w:pPr>
-            <w:r>
-              <w:rPr>
-                <w:rFonts w:ascii="BRH Devanagari Extra" w:hAnsi="BRH Devanagari Extra" w:cs="BRH Devanagari Extra"/>
-                <w:color w:val="000000"/>
-                <w:sz w:val="40"/>
-                <w:szCs w:val="40"/>
-              </w:rPr>
-              <w:t>uÉæMüþXçMüiÉÏ kÉëÑ</w:t>
-            </w:r>
+            <w:proofErr w:type="spellStart"/>
+            <w:r>
+              <w:rPr>
+                <w:rFonts w:ascii="BRH Devanagari Extra" w:hAnsi="BRH Devanagari Extra" w:cs="BRH Devanagari Extra"/>
+                <w:color w:val="000000"/>
+                <w:sz w:val="40"/>
+                <w:szCs w:val="40"/>
+              </w:rPr>
+              <w:t>uÉæMüþXçMüiÉÏ</w:t>
+            </w:r>
+            <w:proofErr w:type="spellEnd"/>
+            <w:r>
+              <w:rPr>
+                <w:rFonts w:ascii="BRH Devanagari Extra" w:hAnsi="BRH Devanagari Extra" w:cs="BRH Devanagari Extra"/>
+                <w:color w:val="000000"/>
+                <w:sz w:val="40"/>
+                <w:szCs w:val="40"/>
+              </w:rPr>
+              <w:t xml:space="preserve"> </w:t>
+            </w:r>
+            <w:proofErr w:type="spellStart"/>
+            <w:r>
+              <w:rPr>
+                <w:rFonts w:ascii="BRH Devanagari Extra" w:hAnsi="BRH Devanagari Extra" w:cs="BRH Devanagari Extra"/>
+                <w:color w:val="000000"/>
+                <w:sz w:val="40"/>
+                <w:szCs w:val="40"/>
+              </w:rPr>
+              <w:t>kÉëÑ</w:t>
+            </w:r>
+            <w:proofErr w:type="spellEnd"/>
             <w:r>
               <w:rPr>
                 <w:rFonts w:ascii="BRH Malayalam Extra" w:hAnsi="BRH Malayalam Extra" w:cs="BRH Devanagari Extra"/>
@@ -687,15 +2527,27 @@
               </w:rPr>
               <w:t>–</w:t>
             </w:r>
-            <w:r>
-              <w:rPr>
-                <w:rFonts w:ascii="BRH Devanagari Extra" w:hAnsi="BRH Devanagari Extra" w:cs="BRH Devanagari Extra"/>
-                <w:color w:val="000000"/>
-                <w:sz w:val="40"/>
-                <w:szCs w:val="40"/>
-              </w:rPr>
-              <w:t xml:space="preserve">uÉÉ | </w:t>
-            </w:r>
+            <w:proofErr w:type="spellStart"/>
+            <w:r>
+              <w:rPr>
+                <w:rFonts w:ascii="BRH Devanagari Extra" w:hAnsi="BRH Devanagari Extra" w:cs="BRH Devanagari Extra"/>
+                <w:color w:val="000000"/>
+                <w:sz w:val="40"/>
+                <w:szCs w:val="40"/>
+              </w:rPr>
+              <w:t>uÉÉ</w:t>
+            </w:r>
+            <w:proofErr w:type="spellEnd"/>
+            <w:r>
+              <w:rPr>
+                <w:rFonts w:ascii="BRH Devanagari Extra" w:hAnsi="BRH Devanagari Extra" w:cs="BRH Devanagari Extra"/>
+                <w:color w:val="000000"/>
+                <w:sz w:val="40"/>
+                <w:szCs w:val="40"/>
+              </w:rPr>
+              <w:t xml:space="preserve"> | </w:t>
+            </w:r>
+            <w:proofErr w:type="spellStart"/>
             <w:r>
               <w:rPr>
                 <w:rFonts w:ascii="BRH Devanagari Extra" w:hAnsi="BRH Devanagari Extra" w:cs="BRH Devanagari Extra"/>
@@ -706,6 +2558,7 @@
               </w:rPr>
               <w:t>kÉÑ</w:t>
             </w:r>
+            <w:proofErr w:type="spellEnd"/>
             <w:r>
               <w:rPr>
                 <w:rFonts w:ascii="BRH Malayalam Extra" w:hAnsi="BRH Malayalam Extra" w:cs="BRH Devanagari Extra"/>
@@ -717,14 +2570,45 @@
               </w:rPr>
               <w:t>–</w:t>
             </w:r>
-            <w:r>
-              <w:rPr>
-                <w:rFonts w:ascii="BRH Devanagari Extra" w:hAnsi="BRH Devanagari Extra" w:cs="BRH Devanagari Extra"/>
-                <w:color w:val="000000"/>
-                <w:sz w:val="40"/>
-                <w:szCs w:val="40"/>
-              </w:rPr>
-              <w:t>uÉÉ pÉuÉþÌiÉ |</w:t>
+            <w:proofErr w:type="spellStart"/>
+            <w:r>
+              <w:rPr>
+                <w:rFonts w:ascii="BRH Devanagari Extra" w:hAnsi="BRH Devanagari Extra" w:cs="BRH Devanagari Extra"/>
+                <w:color w:val="000000"/>
+                <w:sz w:val="40"/>
+                <w:szCs w:val="40"/>
+              </w:rPr>
+              <w:t>uÉÉ</w:t>
+            </w:r>
+            <w:proofErr w:type="spellEnd"/>
+            <w:r>
+              <w:rPr>
+                <w:rFonts w:ascii="BRH Devanagari Extra" w:hAnsi="BRH Devanagari Extra" w:cs="BRH Devanagari Extra"/>
+                <w:color w:val="000000"/>
+                <w:sz w:val="40"/>
+                <w:szCs w:val="40"/>
+              </w:rPr>
+              <w:t xml:space="preserve"> </w:t>
+            </w:r>
+            <w:proofErr w:type="spellStart"/>
+            <w:r>
+              <w:rPr>
+                <w:rFonts w:ascii="BRH Devanagari Extra" w:hAnsi="BRH Devanagari Extra" w:cs="BRH Devanagari Extra"/>
+                <w:color w:val="000000"/>
+                <w:sz w:val="40"/>
+                <w:szCs w:val="40"/>
+              </w:rPr>
+              <w:t>pÉuÉþÌiÉ</w:t>
+            </w:r>
+            <w:proofErr w:type="spellEnd"/>
+            <w:r>
+              <w:rPr>
+                <w:rFonts w:ascii="BRH Devanagari Extra" w:hAnsi="BRH Devanagari Extra" w:cs="BRH Devanagari Extra"/>
+                <w:color w:val="000000"/>
+                <w:sz w:val="40"/>
+                <w:szCs w:val="40"/>
+              </w:rPr>
+              <w:t xml:space="preserve"> |</w:t>
             </w:r>
           </w:p>
         </w:tc>
@@ -742,15 +2626,37 @@
                 <w:szCs w:val="40"/>
               </w:rPr>
             </w:pPr>
-            <w:r>
-              <w:rPr>
-                <w:rFonts w:ascii="BRH Devanagari Extra" w:hAnsi="BRH Devanagari Extra" w:cs="BRH Devanagari Extra"/>
-                <w:color w:val="000000"/>
-                <w:sz w:val="40"/>
-                <w:szCs w:val="40"/>
-              </w:rPr>
-              <w:t>uÉæMüþXçMüiÉÏ kÉëÑ</w:t>
-            </w:r>
+            <w:proofErr w:type="spellStart"/>
+            <w:r>
+              <w:rPr>
+                <w:rFonts w:ascii="BRH Devanagari Extra" w:hAnsi="BRH Devanagari Extra" w:cs="BRH Devanagari Extra"/>
+                <w:color w:val="000000"/>
+                <w:sz w:val="40"/>
+                <w:szCs w:val="40"/>
+              </w:rPr>
+              <w:t>uÉæMüþXçMüiÉÏ</w:t>
+            </w:r>
+            <w:proofErr w:type="spellEnd"/>
+            <w:r>
+              <w:rPr>
+                <w:rFonts w:ascii="BRH Devanagari Extra" w:hAnsi="BRH Devanagari Extra" w:cs="BRH Devanagari Extra"/>
+                <w:color w:val="000000"/>
+                <w:sz w:val="40"/>
+                <w:szCs w:val="40"/>
+              </w:rPr>
+              <w:t xml:space="preserve"> </w:t>
+            </w:r>
+            <w:proofErr w:type="spellStart"/>
+            <w:r>
+              <w:rPr>
+                <w:rFonts w:ascii="BRH Devanagari Extra" w:hAnsi="BRH Devanagari Extra" w:cs="BRH Devanagari Extra"/>
+                <w:color w:val="000000"/>
+                <w:sz w:val="40"/>
+                <w:szCs w:val="40"/>
+              </w:rPr>
+              <w:t>kÉëÑ</w:t>
+            </w:r>
+            <w:proofErr w:type="spellEnd"/>
             <w:r>
               <w:rPr>
                 <w:rFonts w:ascii="BRH Malayalam Extra" w:hAnsi="BRH Malayalam Extra" w:cs="BRH Devanagari Extra"/>
@@ -761,15 +2667,27 @@
               </w:rPr>
               <w:t>–</w:t>
             </w:r>
-            <w:r>
-              <w:rPr>
-                <w:rFonts w:ascii="BRH Devanagari Extra" w:hAnsi="BRH Devanagari Extra" w:cs="BRH Devanagari Extra"/>
-                <w:color w:val="000000"/>
-                <w:sz w:val="40"/>
-                <w:szCs w:val="40"/>
-              </w:rPr>
-              <w:t xml:space="preserve">uÉÉ | </w:t>
-            </w:r>
+            <w:proofErr w:type="spellStart"/>
+            <w:r>
+              <w:rPr>
+                <w:rFonts w:ascii="BRH Devanagari Extra" w:hAnsi="BRH Devanagari Extra" w:cs="BRH Devanagari Extra"/>
+                <w:color w:val="000000"/>
+                <w:sz w:val="40"/>
+                <w:szCs w:val="40"/>
+              </w:rPr>
+              <w:t>uÉÉ</w:t>
+            </w:r>
+            <w:proofErr w:type="spellEnd"/>
+            <w:r>
+              <w:rPr>
+                <w:rFonts w:ascii="BRH Devanagari Extra" w:hAnsi="BRH Devanagari Extra" w:cs="BRH Devanagari Extra"/>
+                <w:color w:val="000000"/>
+                <w:sz w:val="40"/>
+                <w:szCs w:val="40"/>
+              </w:rPr>
+              <w:t xml:space="preserve"> | </w:t>
+            </w:r>
+            <w:proofErr w:type="spellStart"/>
             <w:r>
               <w:rPr>
                 <w:rFonts w:ascii="BRH Devanagari Extra" w:hAnsi="BRH Devanagari Extra" w:cs="BRH Devanagari Extra"/>
@@ -789,6 +2707,7 @@
               </w:rPr>
               <w:t>Ñ</w:t>
             </w:r>
+            <w:proofErr w:type="spellEnd"/>
             <w:r>
               <w:rPr>
                 <w:rFonts w:ascii="BRH Malayalam Extra" w:hAnsi="BRH Malayalam Extra" w:cs="BRH Devanagari Extra"/>
@@ -799,45 +2718,523 @@
               </w:rPr>
               <w:t>–</w:t>
             </w:r>
-            <w:r>
-              <w:rPr>
-                <w:rFonts w:ascii="BRH Devanagari Extra" w:hAnsi="BRH Devanagari Extra" w:cs="BRH Devanagari Extra"/>
-                <w:color w:val="000000"/>
-                <w:sz w:val="40"/>
-                <w:szCs w:val="40"/>
-              </w:rPr>
-              <w:t>uÉÉ pÉuÉþÌiÉ |</w:t>
+            <w:proofErr w:type="spellStart"/>
+            <w:r>
+              <w:rPr>
+                <w:rFonts w:ascii="BRH Devanagari Extra" w:hAnsi="BRH Devanagari Extra" w:cs="BRH Devanagari Extra"/>
+                <w:color w:val="000000"/>
+                <w:sz w:val="40"/>
+                <w:szCs w:val="40"/>
+              </w:rPr>
+              <w:t>uÉÉ</w:t>
+            </w:r>
+            <w:proofErr w:type="spellEnd"/>
+            <w:r>
+              <w:rPr>
+                <w:rFonts w:ascii="BRH Devanagari Extra" w:hAnsi="BRH Devanagari Extra" w:cs="BRH Devanagari Extra"/>
+                <w:color w:val="000000"/>
+                <w:sz w:val="40"/>
+                <w:szCs w:val="40"/>
+              </w:rPr>
+              <w:t xml:space="preserve"> </w:t>
+            </w:r>
+            <w:proofErr w:type="spellStart"/>
+            <w:r>
+              <w:rPr>
+                <w:rFonts w:ascii="BRH Devanagari Extra" w:hAnsi="BRH Devanagari Extra" w:cs="BRH Devanagari Extra"/>
+                <w:color w:val="000000"/>
+                <w:sz w:val="40"/>
+                <w:szCs w:val="40"/>
+              </w:rPr>
+              <w:t>pÉuÉþÌiÉ</w:t>
+            </w:r>
+            <w:proofErr w:type="spellEnd"/>
+            <w:r>
+              <w:rPr>
+                <w:rFonts w:ascii="BRH Devanagari Extra" w:hAnsi="BRH Devanagari Extra" w:cs="BRH Devanagari Extra"/>
+                <w:color w:val="000000"/>
+                <w:sz w:val="40"/>
+                <w:szCs w:val="40"/>
+              </w:rPr>
+              <w:t xml:space="preserve"> |</w:t>
+            </w:r>
+          </w:p>
+        </w:tc>
+      </w:tr>
+      <w:tr>
+        <w:trPr>
+          <w:gridAfter w:val="1"/>
+          <w:wAfter w:w="142" w:type="dxa"/>
+          <w:trHeight w:val="1118"/>
+        </w:trPr>
+        <w:tc>
+          <w:tcPr>
+            <w:tcW w:w="3906" w:type="dxa"/>
+          </w:tcPr>
+          <w:p>
+            <w:pPr>
+              <w:widowControl w:val="0"/>
+              <w:tabs>
+                <w:tab w:val="left" w:pos="993"/>
+              </w:tabs>
+              <w:autoSpaceDE w:val="0"/>
+              <w:autoSpaceDN w:val="0"/>
+              <w:adjustRightInd w:val="0"/>
+              <w:spacing w:before="0" w:line="240" w:lineRule="auto"/>
+              <w:ind w:right="297"/>
+              <w:rPr>
+                <w:rFonts w:cs="Arial"/>
+                <w:b/>
+                <w:color w:val="000000"/>
+                <w:sz w:val="28"/>
+                <w:szCs w:val="32"/>
+              </w:rPr>
+            </w:pPr>
+            <w:r>
+              <w:rPr>
+                <w:rFonts w:cs="Arial"/>
+                <w:b/>
+                <w:color w:val="000000"/>
+                <w:sz w:val="28"/>
+                <w:szCs w:val="32"/>
+              </w:rPr>
+              <w:t>T.S.</w:t>
+            </w:r>
+            <w:r>
+              <w:rPr>
+                <w:rFonts w:cs="Arial"/>
+                <w:b/>
+                <w:color w:val="000000"/>
+                <w:sz w:val="28"/>
+                <w:szCs w:val="32"/>
+              </w:rPr>
+              <w:t xml:space="preserve">3.5.11.4 </w:t>
+            </w:r>
+            <w:r>
+              <w:rPr>
+                <w:rFonts w:cs="Arial"/>
+                <w:b/>
+                <w:color w:val="000000"/>
+                <w:sz w:val="28"/>
+                <w:szCs w:val="32"/>
+              </w:rPr>
+              <w:t>– Kramam</w:t>
+            </w:r>
+          </w:p>
+          <w:p>
+            <w:pPr>
+              <w:widowControl w:val="0"/>
+              <w:tabs>
+                <w:tab w:val="left" w:pos="993"/>
+              </w:tabs>
+              <w:autoSpaceDE w:val="0"/>
+              <w:autoSpaceDN w:val="0"/>
+              <w:adjustRightInd w:val="0"/>
+              <w:spacing w:before="0" w:line="240" w:lineRule="auto"/>
+              <w:ind w:right="297"/>
+              <w:rPr>
+                <w:rFonts w:cs="Arial"/>
+                <w:b/>
+                <w:color w:val="000000"/>
+                <w:sz w:val="28"/>
+                <w:szCs w:val="32"/>
+                <w:lang w:val="en-IN"/>
+              </w:rPr>
+            </w:pPr>
+            <w:r>
+              <w:rPr>
+                <w:rFonts w:cs="Arial"/>
+                <w:b/>
+                <w:color w:val="000000"/>
+                <w:sz w:val="28"/>
+                <w:szCs w:val="32"/>
+                <w:lang w:val="en-IN"/>
+              </w:rPr>
+              <w:t xml:space="preserve">Krama Vaakyam No. </w:t>
+            </w:r>
+            <w:r>
+              <w:rPr>
+                <w:rFonts w:cs="Arial"/>
+                <w:b/>
+                <w:color w:val="000000"/>
+                <w:sz w:val="28"/>
+                <w:szCs w:val="32"/>
+                <w:lang w:val="en-IN"/>
+              </w:rPr>
+              <w:t>–</w:t>
+            </w:r>
+            <w:r>
+              <w:rPr>
+                <w:rFonts w:cs="Arial"/>
+                <w:b/>
+                <w:color w:val="000000"/>
+                <w:sz w:val="28"/>
+                <w:szCs w:val="32"/>
+                <w:lang w:val="en-IN"/>
+              </w:rPr>
+              <w:t xml:space="preserve"> </w:t>
+            </w:r>
+            <w:r>
+              <w:rPr>
+                <w:rFonts w:cs="Arial"/>
+                <w:b/>
+                <w:color w:val="000000"/>
+                <w:sz w:val="28"/>
+                <w:szCs w:val="32"/>
+                <w:lang w:val="en-IN"/>
+              </w:rPr>
+              <w:t>1,2</w:t>
+            </w:r>
+          </w:p>
+          <w:p>
+            <w:pPr>
+              <w:widowControl w:val="0"/>
+              <w:tabs>
+                <w:tab w:val="left" w:pos="993"/>
+              </w:tabs>
+              <w:autoSpaceDE w:val="0"/>
+              <w:autoSpaceDN w:val="0"/>
+              <w:adjustRightInd w:val="0"/>
+              <w:spacing w:before="0" w:line="240" w:lineRule="auto"/>
+              <w:ind w:right="297"/>
+              <w:rPr>
+                <w:rFonts w:cs="Arial"/>
+                <w:b/>
+                <w:color w:val="000000"/>
+                <w:sz w:val="28"/>
+                <w:szCs w:val="32"/>
+              </w:rPr>
+            </w:pPr>
+            <w:r>
+              <w:rPr>
+                <w:rFonts w:cs="Arial"/>
+                <w:b/>
+                <w:color w:val="000000"/>
+                <w:sz w:val="28"/>
+                <w:szCs w:val="32"/>
+                <w:lang w:val="it-IT"/>
+              </w:rPr>
+              <w:t>Panchaati No</w:t>
+            </w:r>
+            <w:r>
+              <w:rPr>
+                <w:rFonts w:cs="Arial"/>
+                <w:b/>
+                <w:color w:val="000000"/>
+                <w:szCs w:val="32"/>
+                <w:lang w:val="it-IT"/>
+              </w:rPr>
+              <w:t xml:space="preserve">. - </w:t>
+            </w:r>
+            <w:r>
+              <w:rPr>
+                <w:rFonts w:cs="Arial"/>
+                <w:b/>
+                <w:color w:val="000000"/>
+                <w:sz w:val="28"/>
+                <w:szCs w:val="28"/>
+                <w:lang w:val="it-IT"/>
+              </w:rPr>
+              <w:t>30</w:t>
+            </w:r>
+          </w:p>
+        </w:tc>
+        <w:tc>
+          <w:tcPr>
+            <w:tcW w:w="5103" w:type="dxa"/>
+            <w:gridSpan w:val="2"/>
+          </w:tcPr>
+          <w:p>
+            <w:pPr>
+              <w:widowControl w:val="0"/>
+              <w:autoSpaceDE w:val="0"/>
+              <w:autoSpaceDN w:val="0"/>
+              <w:adjustRightInd w:val="0"/>
+              <w:spacing w:before="0" w:line="240" w:lineRule="auto"/>
+              <w:rPr>
+                <w:rFonts w:ascii="BRH Devanagari Extra" w:hAnsi="BRH Devanagari Extra" w:cs="BRH Devanagari Extra"/>
+                <w:color w:val="000000"/>
+                <w:sz w:val="40"/>
+                <w:szCs w:val="40"/>
+              </w:rPr>
+            </w:pPr>
+            <w:proofErr w:type="spellStart"/>
+            <w:r>
+              <w:rPr>
+                <w:rFonts w:ascii="BRH Devanagari Extra" w:hAnsi="BRH Devanagari Extra" w:cs="BRH Devanagari Extra"/>
+                <w:color w:val="000000"/>
+                <w:sz w:val="40"/>
+                <w:szCs w:val="40"/>
+              </w:rPr>
+              <w:t>iuÉÉ</w:t>
+            </w:r>
+            <w:proofErr w:type="spellEnd"/>
+            <w:r>
+              <w:rPr>
+                <w:rFonts w:ascii="BRH Malayalam Extra" w:hAnsi="BRH Malayalam Extra" w:cs="BRH Devanagari Extra"/>
+                <w:b/>
+                <w:color w:val="000000"/>
+                <w:sz w:val="32"/>
+                <w:szCs w:val="40"/>
+              </w:rPr>
+              <w:t>–</w:t>
+            </w:r>
+            <w:r>
+              <w:rPr>
+                <w:rFonts w:ascii="BRH Devanagari Extra" w:hAnsi="BRH Devanagari Extra" w:cs="BRH Devanagari Extra"/>
+                <w:color w:val="000000"/>
+                <w:sz w:val="40"/>
+                <w:szCs w:val="40"/>
+              </w:rPr>
+              <w:t xml:space="preserve"> S</w:t>
+            </w:r>
+            <w:r>
+              <w:rPr>
+                <w:rFonts w:ascii="BRH Malayalam Extra" w:hAnsi="BRH Malayalam Extra" w:cs="BRH Devanagari Extra"/>
+                <w:b/>
+                <w:color w:val="000000"/>
+                <w:sz w:val="32"/>
+                <w:szCs w:val="40"/>
+              </w:rPr>
+              <w:t>–</w:t>
+            </w:r>
+            <w:proofErr w:type="spellStart"/>
+            <w:r>
+              <w:rPr>
+                <w:rFonts w:ascii="BRH Devanagari Extra" w:hAnsi="BRH Devanagari Extra" w:cs="BRH Devanagari Extra"/>
+                <w:color w:val="000000"/>
+                <w:sz w:val="40"/>
+                <w:szCs w:val="40"/>
+              </w:rPr>
+              <w:t>SèkrÉXçXèû</w:t>
+            </w:r>
+            <w:proofErr w:type="spellEnd"/>
+            <w:r>
+              <w:rPr>
+                <w:rFonts w:ascii="BRH Devanagari Extra" w:hAnsi="BRH Devanagari Extra" w:cs="BRH Devanagari Extra"/>
+                <w:color w:val="000000"/>
+                <w:sz w:val="40"/>
+                <w:szCs w:val="40"/>
+              </w:rPr>
+              <w:t xml:space="preserve"> | S</w:t>
+            </w:r>
+            <w:r>
+              <w:rPr>
+                <w:rFonts w:ascii="BRH Malayalam Extra" w:hAnsi="BRH Malayalam Extra" w:cs="BRH Devanagari Extra"/>
+                <w:b/>
+                <w:color w:val="000000"/>
+                <w:sz w:val="32"/>
+                <w:szCs w:val="40"/>
+              </w:rPr>
+              <w:t>–</w:t>
+            </w:r>
+            <w:proofErr w:type="spellStart"/>
+            <w:r>
+              <w:rPr>
+                <w:rFonts w:ascii="BRH Devanagari Extra" w:hAnsi="BRH Devanagari Extra" w:cs="BRH Devanagari Extra"/>
+                <w:color w:val="000000"/>
+                <w:sz w:val="40"/>
+                <w:szCs w:val="40"/>
+              </w:rPr>
+              <w:t>SèkrÉ</w:t>
+            </w:r>
+            <w:r>
+              <w:rPr>
+                <w:rFonts w:ascii="BRH Devanagari Extra" w:hAnsi="BRH Devanagari Extra" w:cs="BRH Devanagari Extra"/>
+                <w:color w:val="EE0000"/>
+                <w:sz w:val="40"/>
+                <w:szCs w:val="40"/>
+                <w:highlight w:val="yellow"/>
+              </w:rPr>
+              <w:t>Xèû</w:t>
+            </w:r>
+            <w:proofErr w:type="spellEnd"/>
+            <w:r>
+              <w:rPr>
+                <w:rFonts w:ascii="BRH Devanagari Extra" w:hAnsi="BRH Devanagari Extra" w:cs="BRH Devanagari Extra"/>
+                <w:color w:val="EE0000"/>
+                <w:sz w:val="40"/>
+                <w:szCs w:val="40"/>
+                <w:highlight w:val="yellow"/>
+              </w:rPr>
+              <w:t xml:space="preserve"> </w:t>
+            </w:r>
+            <w:proofErr w:type="spellStart"/>
+            <w:r>
+              <w:rPr>
+                <w:rFonts w:ascii="BRH Devanagari Extra" w:hAnsi="BRH Devanagari Extra" w:cs="BRH Devanagari Extra"/>
+                <w:color w:val="EE0000"/>
+                <w:sz w:val="40"/>
+                <w:szCs w:val="40"/>
+                <w:highlight w:val="yellow"/>
+              </w:rPr>
+              <w:t>G</w:t>
+            </w:r>
+            <w:r>
+              <w:rPr>
+                <w:rFonts w:ascii="BRH Devanagari Extra" w:hAnsi="BRH Devanagari Extra" w:cs="BRH Devanagari Extra"/>
+                <w:color w:val="000000"/>
+                <w:sz w:val="40"/>
+                <w:szCs w:val="40"/>
+              </w:rPr>
+              <w:t>ÌwÉþÈ</w:t>
+            </w:r>
+            <w:proofErr w:type="spellEnd"/>
+            <w:r>
+              <w:rPr>
+                <w:rFonts w:ascii="BRH Devanagari Extra" w:hAnsi="BRH Devanagari Extra" w:cs="BRH Devanagari Extra"/>
+                <w:color w:val="000000"/>
+                <w:sz w:val="40"/>
+                <w:szCs w:val="40"/>
+              </w:rPr>
+              <w:t xml:space="preserve"> |</w:t>
+            </w:r>
+          </w:p>
+        </w:tc>
+        <w:tc>
+          <w:tcPr>
+            <w:tcW w:w="5386" w:type="dxa"/>
+          </w:tcPr>
+          <w:p>
+            <w:pPr>
+              <w:spacing w:before="0" w:line="240" w:lineRule="auto"/>
+              <w:rPr>
+                <w:rFonts w:ascii="BRH Devanagari Extra" w:hAnsi="BRH Devanagari Extra" w:cs="BRH Devanagari Extra"/>
+                <w:color w:val="000000"/>
+                <w:sz w:val="40"/>
+                <w:szCs w:val="40"/>
+              </w:rPr>
+            </w:pPr>
+            <w:proofErr w:type="spellStart"/>
+            <w:r>
+              <w:rPr>
+                <w:rFonts w:ascii="BRH Devanagari Extra" w:hAnsi="BRH Devanagari Extra" w:cs="BRH Devanagari Extra"/>
+                <w:color w:val="000000"/>
+                <w:sz w:val="40"/>
+                <w:szCs w:val="40"/>
+              </w:rPr>
+              <w:t>iuÉÉ</w:t>
+            </w:r>
+            <w:proofErr w:type="spellEnd"/>
+            <w:r>
+              <w:rPr>
+                <w:rFonts w:ascii="BRH Malayalam Extra" w:hAnsi="BRH Malayalam Extra" w:cs="BRH Devanagari Extra"/>
+                <w:b/>
+                <w:color w:val="000000"/>
+                <w:sz w:val="32"/>
+                <w:szCs w:val="40"/>
+              </w:rPr>
+              <w:t>–</w:t>
+            </w:r>
+            <w:r>
+              <w:rPr>
+                <w:rFonts w:ascii="BRH Devanagari Extra" w:hAnsi="BRH Devanagari Extra" w:cs="BRH Devanagari Extra"/>
+                <w:color w:val="000000"/>
+                <w:sz w:val="40"/>
+                <w:szCs w:val="40"/>
+              </w:rPr>
+              <w:t xml:space="preserve"> S</w:t>
+            </w:r>
+            <w:r>
+              <w:rPr>
+                <w:rFonts w:ascii="BRH Malayalam Extra" w:hAnsi="BRH Malayalam Extra" w:cs="BRH Devanagari Extra"/>
+                <w:b/>
+                <w:color w:val="000000"/>
+                <w:sz w:val="32"/>
+                <w:szCs w:val="40"/>
+              </w:rPr>
+              <w:t>–</w:t>
+            </w:r>
+            <w:proofErr w:type="spellStart"/>
+            <w:r>
+              <w:rPr>
+                <w:rFonts w:ascii="BRH Devanagari Extra" w:hAnsi="BRH Devanagari Extra" w:cs="BRH Devanagari Extra"/>
+                <w:color w:val="000000"/>
+                <w:sz w:val="40"/>
+                <w:szCs w:val="40"/>
+              </w:rPr>
+              <w:t>SèkrÉXçXèû</w:t>
+            </w:r>
+            <w:proofErr w:type="spellEnd"/>
+            <w:r>
+              <w:rPr>
+                <w:rFonts w:ascii="BRH Devanagari Extra" w:hAnsi="BRH Devanagari Extra" w:cs="BRH Devanagari Extra"/>
+                <w:color w:val="000000"/>
+                <w:sz w:val="40"/>
+                <w:szCs w:val="40"/>
+              </w:rPr>
+              <w:t xml:space="preserve"> | S</w:t>
+            </w:r>
+            <w:r>
+              <w:rPr>
+                <w:rFonts w:ascii="BRH Malayalam Extra" w:hAnsi="BRH Malayalam Extra" w:cs="BRH Devanagari Extra"/>
+                <w:b/>
+                <w:color w:val="000000"/>
+                <w:sz w:val="32"/>
+                <w:szCs w:val="40"/>
+              </w:rPr>
+              <w:t>–</w:t>
+            </w:r>
+            <w:proofErr w:type="spellStart"/>
+            <w:r>
+              <w:rPr>
+                <w:rFonts w:ascii="BRH Devanagari Extra" w:hAnsi="BRH Devanagari Extra" w:cs="BRH Devanagari Extra"/>
+                <w:color w:val="000000"/>
+                <w:sz w:val="40"/>
+                <w:szCs w:val="40"/>
+              </w:rPr>
+              <w:t>SèkrÉXèû</w:t>
+            </w:r>
+            <w:r>
+              <w:rPr>
+                <w:rFonts w:ascii="BRH Devanagari Extra" w:hAnsi="BRH Devanagari Extra" w:cs="BRH Devanagari Extra"/>
+                <w:color w:val="EE0000"/>
+                <w:sz w:val="40"/>
+                <w:szCs w:val="40"/>
+              </w:rPr>
+              <w:t>X</w:t>
+            </w:r>
+            <w:r>
+              <w:rPr>
+                <w:rFonts w:ascii="BRH Devanagari Extra" w:hAnsi="BRH Devanagari Extra" w:cs="BRH Devanagari Extra"/>
+                <w:color w:val="EE0000"/>
+                <w:sz w:val="40"/>
+                <w:szCs w:val="40"/>
+              </w:rPr>
+              <w:t>,</w:t>
+            </w:r>
+            <w:r>
+              <w:rPr>
+                <w:rFonts w:ascii="BRH Devanagari Extra" w:hAnsi="BRH Devanagari Extra" w:cs="BRH Devanagari Extra"/>
+                <w:color w:val="EE0000"/>
+                <w:sz w:val="40"/>
+                <w:szCs w:val="40"/>
+              </w:rPr>
+              <w:t>G</w:t>
+            </w:r>
+            <w:r>
+              <w:rPr>
+                <w:rFonts w:ascii="BRH Devanagari Extra" w:hAnsi="BRH Devanagari Extra" w:cs="BRH Devanagari Extra"/>
+                <w:color w:val="000000"/>
+                <w:sz w:val="40"/>
+                <w:szCs w:val="40"/>
+              </w:rPr>
+              <w:t>ÌwÉþÈ</w:t>
+            </w:r>
+            <w:proofErr w:type="spellEnd"/>
+            <w:r>
+              <w:rPr>
+                <w:rFonts w:ascii="BRH Devanagari Extra" w:hAnsi="BRH Devanagari Extra" w:cs="BRH Devanagari Extra"/>
+                <w:color w:val="000000"/>
+                <w:sz w:val="40"/>
+                <w:szCs w:val="40"/>
+              </w:rPr>
+              <w:t xml:space="preserve"> |</w:t>
             </w:r>
           </w:p>
         </w:tc>
       </w:tr>
     </w:tbl>
-    <w:p>
-      <w:pPr>
-        <w:spacing w:before="0" w:line="240" w:lineRule="auto"/>
-        <w:jc w:val="center"/>
-        <w:rPr>
-          <w:b/>
-          <w:bCs/>
-          <w:sz w:val="32"/>
-          <w:szCs w:val="32"/>
-          <w:u w:val="single"/>
-        </w:rPr>
-      </w:pPr>
-    </w:p>
-    <w:p>
-      <w:pPr>
-        <w:spacing w:before="0" w:line="240" w:lineRule="auto"/>
-        <w:jc w:val="center"/>
-        <w:rPr>
-          <w:b/>
-          <w:bCs/>
-          <w:sz w:val="32"/>
-          <w:szCs w:val="32"/>
-          <w:u w:val="single"/>
-        </w:rPr>
-      </w:pPr>
-    </w:p>
     <w:p>
       <w:pPr>
         <w:spacing w:before="0" w:line="240" w:lineRule="auto"/>
@@ -858,6 +3255,7 @@
           <w:szCs w:val="32"/>
           <w:u w:val="single"/>
         </w:rPr>
+        <w:lastRenderedPageBreak/>
         <w:t>TS Krama Paatam – TS 3.</w:t>
       </w:r>
       <w:r>
@@ -1499,7 +3897,6 @@
                 <w:sz w:val="28"/>
                 <w:szCs w:val="32"/>
               </w:rPr>
-              <w:lastRenderedPageBreak/>
               <w:t>T.S.</w:t>
             </w:r>
             <w:r>
@@ -1680,6 +4077,7 @@
               </w:rPr>
               <w:t>–</w:t>
             </w:r>
+            <w:proofErr w:type="spellStart"/>
             <w:r>
               <w:rPr>
                 <w:rFonts w:ascii="BRH Devanagari Extra" w:hAnsi="BRH Devanagari Extra" w:cs="BRH Devanagari Extra"/>
@@ -1689,6 +4087,7 @@
               </w:rPr>
               <w:t>mrÉÉrÉþqÉÉlÉ</w:t>
             </w:r>
+            <w:proofErr w:type="spellEnd"/>
             <w:r>
               <w:rPr>
                 <w:rFonts w:ascii="BRH Malayalam Extra" w:hAnsi="BRH Malayalam Extra" w:cs="BRH Devanagari Extra"/>
@@ -1699,14 +4098,25 @@
               </w:rPr>
               <w:t>–</w:t>
             </w:r>
-            <w:r>
-              <w:rPr>
-                <w:rFonts w:ascii="BRH Devanagari Extra" w:hAnsi="BRH Devanagari Extra" w:cs="BRH Devanagari Extra"/>
-                <w:color w:val="000000"/>
-                <w:sz w:val="40"/>
-                <w:szCs w:val="40"/>
-              </w:rPr>
-              <w:t xml:space="preserve">qÉlÉÑþ | </w:t>
+            <w:proofErr w:type="spellStart"/>
+            <w:r>
+              <w:rPr>
+                <w:rFonts w:ascii="BRH Devanagari Extra" w:hAnsi="BRH Devanagari Extra" w:cs="BRH Devanagari Extra"/>
+                <w:color w:val="000000"/>
+                <w:sz w:val="40"/>
+                <w:szCs w:val="40"/>
+              </w:rPr>
+              <w:t>qÉlÉÑþ</w:t>
+            </w:r>
+            <w:proofErr w:type="spellEnd"/>
+            <w:r>
+              <w:rPr>
+                <w:rFonts w:ascii="BRH Devanagari Extra" w:hAnsi="BRH Devanagari Extra" w:cs="BRH Devanagari Extra"/>
+                <w:color w:val="000000"/>
+                <w:sz w:val="40"/>
+                <w:szCs w:val="40"/>
+              </w:rPr>
+              <w:t xml:space="preserve"> | </w:t>
             </w:r>
           </w:p>
           <w:p>
@@ -1744,6 +4154,7 @@
               </w:rPr>
               <w:t>–</w:t>
             </w:r>
+            <w:proofErr w:type="spellStart"/>
             <w:r>
               <w:rPr>
                 <w:rFonts w:ascii="BRH Devanagari Extra" w:hAnsi="BRH Devanagari Extra" w:cs="BRH Devanagari Extra"/>
@@ -1753,6 +4164,7 @@
               </w:rPr>
               <w:t>mrÉÉrÉþqÉÉlÉ</w:t>
             </w:r>
+            <w:proofErr w:type="spellEnd"/>
             <w:r>
               <w:rPr>
                 <w:rFonts w:ascii="BRH Malayalam Extra" w:hAnsi="BRH Malayalam Extra" w:cs="BRH Devanagari Extra"/>
@@ -1763,14 +4175,45 @@
               </w:rPr>
               <w:t>–</w:t>
             </w:r>
-            <w:r>
-              <w:rPr>
-                <w:rFonts w:ascii="BRH Devanagari Extra" w:hAnsi="BRH Devanagari Extra" w:cs="BRH Devanagari Extra"/>
-                <w:color w:val="000000"/>
-                <w:sz w:val="40"/>
-                <w:szCs w:val="40"/>
-              </w:rPr>
-              <w:t>ÍqÉirÉÉÿ - mrÉÉrÉþqÉÉlÉqÉç |</w:t>
+            <w:proofErr w:type="spellStart"/>
+            <w:r>
+              <w:rPr>
+                <w:rFonts w:ascii="BRH Devanagari Extra" w:hAnsi="BRH Devanagari Extra" w:cs="BRH Devanagari Extra"/>
+                <w:color w:val="000000"/>
+                <w:sz w:val="40"/>
+                <w:szCs w:val="40"/>
+              </w:rPr>
+              <w:t>ÍqÉirÉÉÿ</w:t>
+            </w:r>
+            <w:proofErr w:type="spellEnd"/>
+            <w:r>
+              <w:rPr>
+                <w:rFonts w:ascii="BRH Devanagari Extra" w:hAnsi="BRH Devanagari Extra" w:cs="BRH Devanagari Extra"/>
+                <w:color w:val="000000"/>
+                <w:sz w:val="40"/>
+                <w:szCs w:val="40"/>
+              </w:rPr>
+              <w:t xml:space="preserve"> - </w:t>
+            </w:r>
+            <w:proofErr w:type="spellStart"/>
+            <w:r>
+              <w:rPr>
+                <w:rFonts w:ascii="BRH Devanagari Extra" w:hAnsi="BRH Devanagari Extra" w:cs="BRH Devanagari Extra"/>
+                <w:color w:val="000000"/>
+                <w:sz w:val="40"/>
+                <w:szCs w:val="40"/>
+              </w:rPr>
+              <w:t>mrÉÉrÉþqÉÉlÉqÉç</w:t>
+            </w:r>
+            <w:proofErr w:type="spellEnd"/>
+            <w:r>
+              <w:rPr>
+                <w:rFonts w:ascii="BRH Devanagari Extra" w:hAnsi="BRH Devanagari Extra" w:cs="BRH Devanagari Extra"/>
+                <w:color w:val="000000"/>
+                <w:sz w:val="40"/>
+                <w:szCs w:val="40"/>
+              </w:rPr>
+              <w:t xml:space="preserve"> |</w:t>
             </w:r>
           </w:p>
         </w:tc>
@@ -1812,6 +4255,7 @@
               </w:rPr>
               <w:t>–</w:t>
             </w:r>
+            <w:proofErr w:type="spellStart"/>
             <w:r>
               <w:rPr>
                 <w:rFonts w:ascii="BRH Devanagari Extra" w:hAnsi="BRH Devanagari Extra" w:cs="BRH Devanagari Extra"/>
@@ -1821,6 +4265,7 @@
               </w:rPr>
               <w:t>mrÉÉrÉþqÉÉlÉ</w:t>
             </w:r>
+            <w:proofErr w:type="spellEnd"/>
             <w:r>
               <w:rPr>
                 <w:rFonts w:ascii="BRH Malayalam Extra" w:hAnsi="BRH Malayalam Extra" w:cs="BRH Devanagari Extra"/>
@@ -1831,14 +4276,25 @@
               </w:rPr>
               <w:t>–</w:t>
             </w:r>
-            <w:r>
-              <w:rPr>
-                <w:rFonts w:ascii="BRH Devanagari Extra" w:hAnsi="BRH Devanagari Extra" w:cs="BRH Devanagari Extra"/>
-                <w:color w:val="000000"/>
-                <w:sz w:val="40"/>
-                <w:szCs w:val="40"/>
-              </w:rPr>
-              <w:t xml:space="preserve">qÉlÉÑþ | </w:t>
+            <w:proofErr w:type="spellStart"/>
+            <w:r>
+              <w:rPr>
+                <w:rFonts w:ascii="BRH Devanagari Extra" w:hAnsi="BRH Devanagari Extra" w:cs="BRH Devanagari Extra"/>
+                <w:color w:val="000000"/>
+                <w:sz w:val="40"/>
+                <w:szCs w:val="40"/>
+              </w:rPr>
+              <w:t>qÉlÉÑþ</w:t>
+            </w:r>
+            <w:proofErr w:type="spellEnd"/>
+            <w:r>
+              <w:rPr>
+                <w:rFonts w:ascii="BRH Devanagari Extra" w:hAnsi="BRH Devanagari Extra" w:cs="BRH Devanagari Extra"/>
+                <w:color w:val="000000"/>
+                <w:sz w:val="40"/>
+                <w:szCs w:val="40"/>
+              </w:rPr>
+              <w:t xml:space="preserve"> | </w:t>
             </w:r>
           </w:p>
           <w:p>
@@ -1872,6 +4328,7 @@
               </w:rPr>
               <w:t>–</w:t>
             </w:r>
+            <w:proofErr w:type="spellStart"/>
             <w:r>
               <w:rPr>
                 <w:rFonts w:ascii="BRH Devanagari Extra" w:hAnsi="BRH Devanagari Extra" w:cs="BRH Devanagari Extra"/>
@@ -1891,6 +4348,7 @@
               </w:rPr>
               <w:t>mrÉÉrÉþqÉÉlÉ</w:t>
             </w:r>
+            <w:proofErr w:type="spellEnd"/>
             <w:r>
               <w:rPr>
                 <w:rFonts w:ascii="BRH Malayalam Extra" w:hAnsi="BRH Malayalam Extra" w:cs="BRH Devanagari Extra"/>
@@ -1901,14 +4359,45 @@
               </w:rPr>
               <w:t>–</w:t>
             </w:r>
-            <w:r>
-              <w:rPr>
-                <w:rFonts w:ascii="BRH Devanagari Extra" w:hAnsi="BRH Devanagari Extra" w:cs="BRH Devanagari Extra"/>
-                <w:color w:val="000000"/>
-                <w:sz w:val="40"/>
-                <w:szCs w:val="40"/>
-              </w:rPr>
-              <w:t>ÍqÉirÉÉÿ - mrÉÉrÉþqÉÉlÉqÉç |</w:t>
+            <w:proofErr w:type="spellStart"/>
+            <w:r>
+              <w:rPr>
+                <w:rFonts w:ascii="BRH Devanagari Extra" w:hAnsi="BRH Devanagari Extra" w:cs="BRH Devanagari Extra"/>
+                <w:color w:val="000000"/>
+                <w:sz w:val="40"/>
+                <w:szCs w:val="40"/>
+              </w:rPr>
+              <w:t>ÍqÉirÉÉÿ</w:t>
+            </w:r>
+            <w:proofErr w:type="spellEnd"/>
+            <w:r>
+              <w:rPr>
+                <w:rFonts w:ascii="BRH Devanagari Extra" w:hAnsi="BRH Devanagari Extra" w:cs="BRH Devanagari Extra"/>
+                <w:color w:val="000000"/>
+                <w:sz w:val="40"/>
+                <w:szCs w:val="40"/>
+              </w:rPr>
+              <w:t xml:space="preserve"> - </w:t>
+            </w:r>
+            <w:proofErr w:type="spellStart"/>
+            <w:r>
+              <w:rPr>
+                <w:rFonts w:ascii="BRH Devanagari Extra" w:hAnsi="BRH Devanagari Extra" w:cs="BRH Devanagari Extra"/>
+                <w:color w:val="000000"/>
+                <w:sz w:val="40"/>
+                <w:szCs w:val="40"/>
+              </w:rPr>
+              <w:t>mrÉÉrÉþqÉÉlÉqÉç</w:t>
+            </w:r>
+            <w:proofErr w:type="spellEnd"/>
+            <w:r>
+              <w:rPr>
+                <w:rFonts w:ascii="BRH Devanagari Extra" w:hAnsi="BRH Devanagari Extra" w:cs="BRH Devanagari Extra"/>
+                <w:color w:val="000000"/>
+                <w:sz w:val="40"/>
+                <w:szCs w:val="40"/>
+              </w:rPr>
+              <w:t xml:space="preserve"> |</w:t>
             </w:r>
           </w:p>
         </w:tc>
@@ -2062,6 +4551,7 @@
               </w:rPr>
               <w:t>–</w:t>
             </w:r>
+            <w:proofErr w:type="spellStart"/>
             <w:r>
               <w:rPr>
                 <w:rFonts w:ascii="BRH Devanagari Extra" w:hAnsi="BRH Devanagari Extra" w:cs="BRH Devanagari Extra"/>
@@ -2079,8 +4569,29 @@
                 <w:sz w:val="40"/>
                 <w:szCs w:val="40"/>
               </w:rPr>
-              <w:t>xÉÉþlÉÈ xÉÑ</w:t>
-            </w:r>
+              <w:t>xÉÉþlÉÈ</w:t>
+            </w:r>
+            <w:proofErr w:type="spellEnd"/>
+            <w:r>
+              <w:rPr>
+                <w:rFonts w:ascii="BRH Devanagari Extra" w:hAnsi="BRH Devanagari Extra" w:cs="BRH Devanagari Extra"/>
+                <w:color w:val="000000"/>
+                <w:sz w:val="40"/>
+                <w:szCs w:val="40"/>
+              </w:rPr>
+              <w:t xml:space="preserve"> </w:t>
+            </w:r>
+            <w:proofErr w:type="spellStart"/>
+            <w:r>
+              <w:rPr>
+                <w:rFonts w:ascii="BRH Devanagari Extra" w:hAnsi="BRH Devanagari Extra" w:cs="BRH Devanagari Extra"/>
+                <w:color w:val="000000"/>
+                <w:sz w:val="40"/>
+                <w:szCs w:val="40"/>
+              </w:rPr>
+              <w:t>xÉÑ</w:t>
+            </w:r>
+            <w:proofErr w:type="spellEnd"/>
             <w:r>
               <w:rPr>
                 <w:rFonts w:ascii="BRH Malayalam Extra" w:hAnsi="BRH Malayalam Extra" w:cs="BRH Devanagari Extra"/>
@@ -2091,14 +4602,25 @@
               </w:rPr>
               <w:t>–</w:t>
             </w:r>
-            <w:r>
-              <w:rPr>
-                <w:rFonts w:ascii="BRH Devanagari Extra" w:hAnsi="BRH Devanagari Extra" w:cs="BRH Devanagari Extra"/>
-                <w:color w:val="000000"/>
-                <w:sz w:val="40"/>
-                <w:szCs w:val="40"/>
-              </w:rPr>
-              <w:t>uÉÏrÉïÿqÉç | AÉ</w:t>
+            <w:proofErr w:type="spellStart"/>
+            <w:r>
+              <w:rPr>
+                <w:rFonts w:ascii="BRH Devanagari Extra" w:hAnsi="BRH Devanagari Extra" w:cs="BRH Devanagari Extra"/>
+                <w:color w:val="000000"/>
+                <w:sz w:val="40"/>
+                <w:szCs w:val="40"/>
+              </w:rPr>
+              <w:t>uÉÏrÉïÿqÉç</w:t>
+            </w:r>
+            <w:proofErr w:type="spellEnd"/>
+            <w:r>
+              <w:rPr>
+                <w:rFonts w:ascii="BRH Devanagari Extra" w:hAnsi="BRH Devanagari Extra" w:cs="BRH Devanagari Extra"/>
+                <w:color w:val="000000"/>
+                <w:sz w:val="40"/>
+                <w:szCs w:val="40"/>
+              </w:rPr>
+              <w:t xml:space="preserve"> | AÉ</w:t>
             </w:r>
             <w:r>
               <w:rPr>
@@ -2110,6 +4632,7 @@
               </w:rPr>
               <w:t>–</w:t>
             </w:r>
+            <w:proofErr w:type="spellStart"/>
             <w:r>
               <w:rPr>
                 <w:rFonts w:ascii="BRH Devanagari Extra" w:hAnsi="BRH Devanagari Extra" w:cs="BRH Devanagari Extra"/>
@@ -2119,6 +4642,7 @@
               </w:rPr>
               <w:t>zÉÉxÉÉþlÉ</w:t>
             </w:r>
+            <w:proofErr w:type="spellEnd"/>
             <w:r>
               <w:rPr>
                 <w:rFonts w:ascii="BRH Malayalam Extra" w:hAnsi="BRH Malayalam Extra" w:cs="BRH Devanagari Extra"/>
@@ -2136,7 +4660,47 @@
                 <w:sz w:val="40"/>
                 <w:szCs w:val="40"/>
               </w:rPr>
-              <w:t xml:space="preserve"> CirÉÉÿ - zÉÉxÉÉþlÉÈ | </w:t>
+              <w:t xml:space="preserve"> </w:t>
+            </w:r>
+            <w:proofErr w:type="spellStart"/>
+            <w:r>
+              <w:rPr>
+                <w:rFonts w:ascii="BRH Devanagari Extra" w:hAnsi="BRH Devanagari Extra" w:cs="BRH Devanagari Extra"/>
+                <w:color w:val="000000"/>
+                <w:sz w:val="40"/>
+                <w:szCs w:val="40"/>
+              </w:rPr>
+              <w:t>CirÉÉÿ</w:t>
+            </w:r>
+            <w:proofErr w:type="spellEnd"/>
+            <w:r>
+              <w:rPr>
+                <w:rFonts w:ascii="BRH Devanagari Extra" w:hAnsi="BRH Devanagari Extra" w:cs="BRH Devanagari Extra"/>
+                <w:color w:val="000000"/>
+                <w:sz w:val="40"/>
+                <w:szCs w:val="40"/>
+              </w:rPr>
+              <w:t xml:space="preserve"> - </w:t>
+            </w:r>
+            <w:proofErr w:type="spellStart"/>
+            <w:r>
+              <w:rPr>
+                <w:rFonts w:ascii="BRH Devanagari Extra" w:hAnsi="BRH Devanagari Extra" w:cs="BRH Devanagari Extra"/>
+                <w:color w:val="000000"/>
+                <w:sz w:val="40"/>
+                <w:szCs w:val="40"/>
+              </w:rPr>
+              <w:t>zÉÉxÉÉþlÉÈ</w:t>
+            </w:r>
+            <w:proofErr w:type="spellEnd"/>
+            <w:r>
+              <w:rPr>
+                <w:rFonts w:ascii="BRH Devanagari Extra" w:hAnsi="BRH Devanagari Extra" w:cs="BRH Devanagari Extra"/>
+                <w:color w:val="000000"/>
+                <w:sz w:val="40"/>
+                <w:szCs w:val="40"/>
+              </w:rPr>
+              <w:t xml:space="preserve"> | </w:t>
             </w:r>
           </w:p>
         </w:tc>
@@ -2174,6 +4738,7 @@
               </w:rPr>
               <w:t>–</w:t>
             </w:r>
+            <w:proofErr w:type="spellStart"/>
             <w:r>
               <w:rPr>
                 <w:rFonts w:ascii="BRH Devanagari Extra" w:hAnsi="BRH Devanagari Extra" w:cs="BRH Devanagari Extra"/>
@@ -2191,8 +4756,29 @@
                 <w:sz w:val="40"/>
                 <w:szCs w:val="40"/>
               </w:rPr>
-              <w:t>xÉÉþlÉÈ xÉÑ</w:t>
-            </w:r>
+              <w:t>xÉÉþlÉÈ</w:t>
+            </w:r>
+            <w:proofErr w:type="spellEnd"/>
+            <w:r>
+              <w:rPr>
+                <w:rFonts w:ascii="BRH Devanagari Extra" w:hAnsi="BRH Devanagari Extra" w:cs="BRH Devanagari Extra"/>
+                <w:color w:val="000000"/>
+                <w:sz w:val="40"/>
+                <w:szCs w:val="40"/>
+              </w:rPr>
+              <w:t xml:space="preserve"> </w:t>
+            </w:r>
+            <w:proofErr w:type="spellStart"/>
+            <w:r>
+              <w:rPr>
+                <w:rFonts w:ascii="BRH Devanagari Extra" w:hAnsi="BRH Devanagari Extra" w:cs="BRH Devanagari Extra"/>
+                <w:color w:val="000000"/>
+                <w:sz w:val="40"/>
+                <w:szCs w:val="40"/>
+              </w:rPr>
+              <w:t>xÉÑ</w:t>
+            </w:r>
+            <w:proofErr w:type="spellEnd"/>
             <w:r>
               <w:rPr>
                 <w:rFonts w:ascii="BRH Malayalam Extra" w:hAnsi="BRH Malayalam Extra" w:cs="BRH Devanagari Extra"/>
@@ -2203,14 +4789,25 @@
               </w:rPr>
               <w:t>–</w:t>
             </w:r>
-            <w:r>
-              <w:rPr>
-                <w:rFonts w:ascii="BRH Devanagari Extra" w:hAnsi="BRH Devanagari Extra" w:cs="BRH Devanagari Extra"/>
-                <w:color w:val="000000"/>
-                <w:sz w:val="40"/>
-                <w:szCs w:val="40"/>
-              </w:rPr>
-              <w:t>uÉÏrÉïÿqÉç | AÉ</w:t>
+            <w:proofErr w:type="spellStart"/>
+            <w:r>
+              <w:rPr>
+                <w:rFonts w:ascii="BRH Devanagari Extra" w:hAnsi="BRH Devanagari Extra" w:cs="BRH Devanagari Extra"/>
+                <w:color w:val="000000"/>
+                <w:sz w:val="40"/>
+                <w:szCs w:val="40"/>
+              </w:rPr>
+              <w:t>uÉÏrÉïÿqÉç</w:t>
+            </w:r>
+            <w:proofErr w:type="spellEnd"/>
+            <w:r>
+              <w:rPr>
+                <w:rFonts w:ascii="BRH Devanagari Extra" w:hAnsi="BRH Devanagari Extra" w:cs="BRH Devanagari Extra"/>
+                <w:color w:val="000000"/>
+                <w:sz w:val="40"/>
+                <w:szCs w:val="40"/>
+              </w:rPr>
+              <w:t xml:space="preserve"> | AÉ</w:t>
             </w:r>
             <w:r>
               <w:rPr>
@@ -2222,6 +4819,7 @@
               </w:rPr>
               <w:t>–</w:t>
             </w:r>
+            <w:proofErr w:type="spellStart"/>
             <w:r>
               <w:rPr>
                 <w:rFonts w:ascii="BRH Devanagari Extra" w:hAnsi="BRH Devanagari Extra" w:cs="BRH Devanagari Extra"/>
@@ -2231,6 +4829,7 @@
               </w:rPr>
               <w:t>zÉÉxÉÉþlÉ</w:t>
             </w:r>
+            <w:proofErr w:type="spellEnd"/>
             <w:r>
               <w:rPr>
                 <w:rFonts w:ascii="BRH Malayalam Extra" w:hAnsi="BRH Malayalam Extra" w:cs="BRH Devanagari Extra"/>
@@ -2248,14 +4847,70 @@
                 <w:sz w:val="40"/>
                 <w:szCs w:val="40"/>
               </w:rPr>
-              <w:t xml:space="preserve"> CirÉÉÿ - zÉÉxÉÉþlÉÈ | </w:t>
+              <w:t xml:space="preserve"> </w:t>
+            </w:r>
+            <w:proofErr w:type="spellStart"/>
+            <w:r>
+              <w:rPr>
+                <w:rFonts w:ascii="BRH Devanagari Extra" w:hAnsi="BRH Devanagari Extra" w:cs="BRH Devanagari Extra"/>
+                <w:color w:val="000000"/>
+                <w:sz w:val="40"/>
+                <w:szCs w:val="40"/>
+              </w:rPr>
+              <w:t>CirÉÉÿ</w:t>
+            </w:r>
+            <w:proofErr w:type="spellEnd"/>
+            <w:r>
+              <w:rPr>
+                <w:rFonts w:ascii="BRH Devanagari Extra" w:hAnsi="BRH Devanagari Extra" w:cs="BRH Devanagari Extra"/>
+                <w:color w:val="000000"/>
+                <w:sz w:val="40"/>
+                <w:szCs w:val="40"/>
+              </w:rPr>
+              <w:t xml:space="preserve"> - </w:t>
+            </w:r>
+            <w:proofErr w:type="spellStart"/>
+            <w:r>
+              <w:rPr>
+                <w:rFonts w:ascii="BRH Devanagari Extra" w:hAnsi="BRH Devanagari Extra" w:cs="BRH Devanagari Extra"/>
+                <w:color w:val="000000"/>
+                <w:sz w:val="40"/>
+                <w:szCs w:val="40"/>
+              </w:rPr>
+              <w:t>zÉÉxÉÉþlÉÈ</w:t>
+            </w:r>
+            <w:proofErr w:type="spellEnd"/>
+            <w:r>
+              <w:rPr>
+                <w:rFonts w:ascii="BRH Devanagari Extra" w:hAnsi="BRH Devanagari Extra" w:cs="BRH Devanagari Extra"/>
+                <w:color w:val="000000"/>
+                <w:sz w:val="40"/>
+                <w:szCs w:val="40"/>
+              </w:rPr>
+              <w:t xml:space="preserve"> | </w:t>
             </w:r>
             <w:r>
               <w:rPr>
                 <w:b/>
                 <w:bCs/>
               </w:rPr>
-              <w:t>(it is deergham)</w:t>
+              <w:t xml:space="preserve">(it is </w:t>
+            </w:r>
+            <w:proofErr w:type="spellStart"/>
+            <w:r>
+              <w:rPr>
+                <w:b/>
+                <w:bCs/>
+              </w:rPr>
+              <w:t>deergham</w:t>
+            </w:r>
+            <w:proofErr w:type="spellEnd"/>
+            <w:r>
+              <w:rPr>
+                <w:b/>
+                <w:bCs/>
+              </w:rPr>
+              <w:t>)</w:t>
             </w:r>
           </w:p>
         </w:tc>
@@ -2436,14 +5091,25 @@
                 <w:lang w:val="en-IN" w:eastAsia="en-IN" w:bidi="ml-IN"/>
               </w:rPr>
             </w:pPr>
-            <w:r>
-              <w:rPr>
-                <w:rFonts w:ascii="BRH Devanagari Extra" w:hAnsi="BRH Devanagari Extra" w:cs="BRH Devanagari Extra"/>
-                <w:color w:val="000000"/>
-                <w:sz w:val="40"/>
-                <w:szCs w:val="40"/>
-              </w:rPr>
-              <w:t>AiÉþ E | F</w:t>
+            <w:proofErr w:type="spellStart"/>
+            <w:r>
+              <w:rPr>
+                <w:rFonts w:ascii="BRH Devanagari Extra" w:hAnsi="BRH Devanagari Extra" w:cs="BRH Devanagari Extra"/>
+                <w:color w:val="000000"/>
+                <w:sz w:val="40"/>
+                <w:szCs w:val="40"/>
+              </w:rPr>
+              <w:t>AiÉþ</w:t>
+            </w:r>
+            <w:proofErr w:type="spellEnd"/>
+            <w:r>
+              <w:rPr>
+                <w:rFonts w:ascii="BRH Devanagari Extra" w:hAnsi="BRH Devanagari Extra" w:cs="BRH Devanagari Extra"/>
+                <w:color w:val="000000"/>
+                <w:sz w:val="40"/>
+                <w:szCs w:val="40"/>
+              </w:rPr>
+              <w:t xml:space="preserve"> E | F</w:t>
             </w:r>
             <w:r>
               <w:rPr>
@@ -2465,6 +5131,7 @@
               </w:rPr>
               <w:t xml:space="preserve"> </w:t>
             </w:r>
+            <w:proofErr w:type="spellStart"/>
             <w:r>
               <w:rPr>
                 <w:rFonts w:ascii="BRH Devanagari Extra" w:hAnsi="BRH Devanagari Extra" w:cs="BRH Devanagari Extra"/>
@@ -2475,14 +5142,55 @@
               </w:rPr>
               <w:t>xÉÑ</w:t>
             </w:r>
-            <w:r>
-              <w:rPr>
-                <w:rFonts w:ascii="BRH Devanagari Extra" w:hAnsi="BRH Devanagari Extra" w:cs="BRH Devanagari Extra"/>
-                <w:color w:val="000000"/>
-                <w:sz w:val="40"/>
-                <w:szCs w:val="40"/>
-              </w:rPr>
-              <w:t xml:space="preserve"> | xÉÑ qÉkÉÑþ |</w:t>
+            <w:proofErr w:type="spellEnd"/>
+            <w:r>
+              <w:rPr>
+                <w:rFonts w:ascii="BRH Devanagari Extra" w:hAnsi="BRH Devanagari Extra" w:cs="BRH Devanagari Extra"/>
+                <w:color w:val="000000"/>
+                <w:sz w:val="40"/>
+                <w:szCs w:val="40"/>
+              </w:rPr>
+              <w:t xml:space="preserve"> | </w:t>
+            </w:r>
+            <w:proofErr w:type="spellStart"/>
+            <w:r>
+              <w:rPr>
+                <w:rFonts w:ascii="BRH Devanagari Extra" w:hAnsi="BRH Devanagari Extra" w:cs="BRH Devanagari Extra"/>
+                <w:color w:val="000000"/>
+                <w:sz w:val="40"/>
+                <w:szCs w:val="40"/>
+              </w:rPr>
+              <w:t>xÉÑ</w:t>
+            </w:r>
+            <w:proofErr w:type="spellEnd"/>
+            <w:r>
+              <w:rPr>
+                <w:rFonts w:ascii="BRH Devanagari Extra" w:hAnsi="BRH Devanagari Extra" w:cs="BRH Devanagari Extra"/>
+                <w:color w:val="000000"/>
+                <w:sz w:val="40"/>
+                <w:szCs w:val="40"/>
+              </w:rPr>
+              <w:t xml:space="preserve"> </w:t>
+            </w:r>
+            <w:proofErr w:type="spellStart"/>
+            <w:r>
+              <w:rPr>
+                <w:rFonts w:ascii="BRH Devanagari Extra" w:hAnsi="BRH Devanagari Extra" w:cs="BRH Devanagari Extra"/>
+                <w:color w:val="000000"/>
+                <w:sz w:val="40"/>
+                <w:szCs w:val="40"/>
+              </w:rPr>
+              <w:t>qÉkÉÑþ</w:t>
+            </w:r>
+            <w:proofErr w:type="spellEnd"/>
+            <w:r>
+              <w:rPr>
+                <w:rFonts w:ascii="BRH Devanagari Extra" w:hAnsi="BRH Devanagari Extra" w:cs="BRH Devanagari Extra"/>
+                <w:color w:val="000000"/>
+                <w:sz w:val="40"/>
+                <w:szCs w:val="40"/>
+              </w:rPr>
+              <w:t xml:space="preserve"> |</w:t>
             </w:r>
           </w:p>
         </w:tc>
@@ -2504,14 +5212,25 @@
                 <w:lang w:val="en-IN" w:eastAsia="en-IN" w:bidi="ml-IN"/>
               </w:rPr>
             </w:pPr>
-            <w:r>
-              <w:rPr>
-                <w:rFonts w:ascii="BRH Devanagari Extra" w:hAnsi="BRH Devanagari Extra" w:cs="BRH Devanagari Extra"/>
-                <w:color w:val="000000"/>
-                <w:sz w:val="40"/>
-                <w:szCs w:val="40"/>
-              </w:rPr>
-              <w:t>AiÉþ E | F</w:t>
+            <w:proofErr w:type="spellStart"/>
+            <w:r>
+              <w:rPr>
+                <w:rFonts w:ascii="BRH Devanagari Extra" w:hAnsi="BRH Devanagari Extra" w:cs="BRH Devanagari Extra"/>
+                <w:color w:val="000000"/>
+                <w:sz w:val="40"/>
+                <w:szCs w:val="40"/>
+              </w:rPr>
+              <w:t>AiÉþ</w:t>
+            </w:r>
+            <w:proofErr w:type="spellEnd"/>
+            <w:r>
+              <w:rPr>
+                <w:rFonts w:ascii="BRH Devanagari Extra" w:hAnsi="BRH Devanagari Extra" w:cs="BRH Devanagari Extra"/>
+                <w:color w:val="000000"/>
+                <w:sz w:val="40"/>
+                <w:szCs w:val="40"/>
+              </w:rPr>
+              <w:t xml:space="preserve"> E | F</w:t>
             </w:r>
             <w:r>
               <w:rPr>
@@ -2533,6 +5252,7 @@
               </w:rPr>
               <w:t xml:space="preserve"> </w:t>
             </w:r>
+            <w:proofErr w:type="spellStart"/>
             <w:r>
               <w:rPr>
                 <w:rFonts w:ascii="BRH Devanagari" w:hAnsi="BRH Devanagari" w:cs="BRH Devanagari"/>
@@ -2544,6 +5264,7 @@
               </w:rPr>
               <w:t>wÉÑ</w:t>
             </w:r>
+            <w:proofErr w:type="spellEnd"/>
             <w:r>
               <w:rPr>
                 <w:rFonts w:ascii="BRH Devanagari" w:hAnsi="BRH Devanagari" w:cs="BRH Devanagari"/>
@@ -2561,7 +5282,47 @@
                 <w:sz w:val="40"/>
                 <w:szCs w:val="40"/>
               </w:rPr>
-              <w:t>| xÉÑ qÉkÉÑþ |</w:t>
+              <w:t xml:space="preserve">| </w:t>
+            </w:r>
+            <w:proofErr w:type="spellStart"/>
+            <w:r>
+              <w:rPr>
+                <w:rFonts w:ascii="BRH Devanagari Extra" w:hAnsi="BRH Devanagari Extra" w:cs="BRH Devanagari Extra"/>
+                <w:color w:val="000000"/>
+                <w:sz w:val="40"/>
+                <w:szCs w:val="40"/>
+              </w:rPr>
+              <w:t>xÉÑ</w:t>
+            </w:r>
+            <w:proofErr w:type="spellEnd"/>
+            <w:r>
+              <w:rPr>
+                <w:rFonts w:ascii="BRH Devanagari Extra" w:hAnsi="BRH Devanagari Extra" w:cs="BRH Devanagari Extra"/>
+                <w:color w:val="000000"/>
+                <w:sz w:val="40"/>
+                <w:szCs w:val="40"/>
+              </w:rPr>
+              <w:t xml:space="preserve"> </w:t>
+            </w:r>
+            <w:proofErr w:type="spellStart"/>
+            <w:r>
+              <w:rPr>
+                <w:rFonts w:ascii="BRH Devanagari Extra" w:hAnsi="BRH Devanagari Extra" w:cs="BRH Devanagari Extra"/>
+                <w:color w:val="000000"/>
+                <w:sz w:val="40"/>
+                <w:szCs w:val="40"/>
+              </w:rPr>
+              <w:t>qÉkÉÑþ</w:t>
+            </w:r>
+            <w:proofErr w:type="spellEnd"/>
+            <w:r>
+              <w:rPr>
+                <w:rFonts w:ascii="BRH Devanagari Extra" w:hAnsi="BRH Devanagari Extra" w:cs="BRH Devanagari Extra"/>
+                <w:color w:val="000000"/>
+                <w:sz w:val="40"/>
+                <w:szCs w:val="40"/>
+              </w:rPr>
+              <w:t xml:space="preserve"> |</w:t>
             </w:r>
           </w:p>
         </w:tc>
@@ -2601,6 +5362,7 @@
                 <w:sz w:val="28"/>
                 <w:szCs w:val="32"/>
               </w:rPr>
+              <w:lastRenderedPageBreak/>
               <w:t>T.S.</w:t>
             </w:r>
             <w:r>
@@ -2780,14 +5542,35 @@
               </w:rPr>
               <w:t>–</w:t>
             </w:r>
-            <w:r>
-              <w:rPr>
-                <w:rFonts w:ascii="BRH Devanagari Extra" w:hAnsi="BRH Devanagari Extra" w:cs="BRH Devanagari Extra"/>
-                <w:color w:val="000000"/>
-                <w:sz w:val="40"/>
-                <w:szCs w:val="40"/>
-              </w:rPr>
-              <w:t>qÉå ÅWû³Éçþ | AWûþ</w:t>
+            <w:proofErr w:type="spellStart"/>
+            <w:r>
+              <w:rPr>
+                <w:rFonts w:ascii="BRH Devanagari Extra" w:hAnsi="BRH Devanagari Extra" w:cs="BRH Devanagari Extra"/>
+                <w:color w:val="000000"/>
+                <w:sz w:val="40"/>
+                <w:szCs w:val="40"/>
+              </w:rPr>
+              <w:t>qÉå</w:t>
+            </w:r>
+            <w:proofErr w:type="spellEnd"/>
+            <w:r>
+              <w:rPr>
+                <w:rFonts w:ascii="BRH Devanagari Extra" w:hAnsi="BRH Devanagari Extra" w:cs="BRH Devanagari Extra"/>
+                <w:color w:val="000000"/>
+                <w:sz w:val="40"/>
+                <w:szCs w:val="40"/>
+              </w:rPr>
+              <w:t xml:space="preserve"> ÅWû³Éçþ | </w:t>
+            </w:r>
+            <w:proofErr w:type="spellStart"/>
+            <w:r>
+              <w:rPr>
+                <w:rFonts w:ascii="BRH Devanagari Extra" w:hAnsi="BRH Devanagari Extra" w:cs="BRH Devanagari Extra"/>
+                <w:color w:val="000000"/>
+                <w:sz w:val="40"/>
+                <w:szCs w:val="40"/>
+              </w:rPr>
+              <w:t>AWûþ</w:t>
             </w:r>
             <w:r>
               <w:rPr>
@@ -2799,6 +5582,7 @@
               </w:rPr>
               <w:t>Xç</w:t>
             </w:r>
+            <w:proofErr w:type="spellEnd"/>
             <w:r>
               <w:rPr>
                 <w:rFonts w:ascii="BRH Devanagari Extra" w:hAnsi="BRH Devanagari Extra" w:cs="BRH Devanagari Extra"/>
@@ -2863,14 +5647,35 @@
               </w:rPr>
               <w:t>–</w:t>
             </w:r>
-            <w:r>
-              <w:rPr>
-                <w:rFonts w:ascii="BRH Devanagari Extra" w:hAnsi="BRH Devanagari Extra" w:cs="BRH Devanagari Extra"/>
-                <w:color w:val="000000"/>
-                <w:sz w:val="40"/>
-                <w:szCs w:val="40"/>
-              </w:rPr>
-              <w:t>qÉå ÅWû³Éçþ | AWûþ</w:t>
+            <w:proofErr w:type="spellStart"/>
+            <w:r>
+              <w:rPr>
+                <w:rFonts w:ascii="BRH Devanagari Extra" w:hAnsi="BRH Devanagari Extra" w:cs="BRH Devanagari Extra"/>
+                <w:color w:val="000000"/>
+                <w:sz w:val="40"/>
+                <w:szCs w:val="40"/>
+              </w:rPr>
+              <w:t>qÉå</w:t>
+            </w:r>
+            <w:proofErr w:type="spellEnd"/>
+            <w:r>
+              <w:rPr>
+                <w:rFonts w:ascii="BRH Devanagari Extra" w:hAnsi="BRH Devanagari Extra" w:cs="BRH Devanagari Extra"/>
+                <w:color w:val="000000"/>
+                <w:sz w:val="40"/>
+                <w:szCs w:val="40"/>
+              </w:rPr>
+              <w:t xml:space="preserve"> ÅWû³Éçþ | </w:t>
+            </w:r>
+            <w:proofErr w:type="spellStart"/>
+            <w:r>
+              <w:rPr>
+                <w:rFonts w:ascii="BRH Devanagari Extra" w:hAnsi="BRH Devanagari Extra" w:cs="BRH Devanagari Extra"/>
+                <w:color w:val="000000"/>
+                <w:sz w:val="40"/>
+                <w:szCs w:val="40"/>
+              </w:rPr>
+              <w:t>AWûþ</w:t>
             </w:r>
             <w:r>
               <w:rPr>
@@ -2882,6 +5687,7 @@
               </w:rPr>
               <w:t>lÉç</w:t>
             </w:r>
+            <w:proofErr w:type="spellEnd"/>
             <w:r>
               <w:rPr>
                 <w:rFonts w:ascii="BRH Devanagari Extra" w:hAnsi="BRH Devanagari Extra" w:cs="BRH Devanagari Extra"/>
@@ -3108,14 +5914,35 @@
               </w:rPr>
               <w:t>–</w:t>
             </w:r>
-            <w:r>
-              <w:rPr>
-                <w:rFonts w:ascii="BRH Devanagari Extra" w:hAnsi="BRH Devanagari Extra" w:cs="BRH Devanagari Extra"/>
-                <w:color w:val="000000"/>
-                <w:sz w:val="40"/>
-                <w:szCs w:val="40"/>
-              </w:rPr>
-              <w:t>qÉå ÅWû³Éçþ | AWûþ</w:t>
+            <w:proofErr w:type="spellStart"/>
+            <w:r>
+              <w:rPr>
+                <w:rFonts w:ascii="BRH Devanagari Extra" w:hAnsi="BRH Devanagari Extra" w:cs="BRH Devanagari Extra"/>
+                <w:color w:val="000000"/>
+                <w:sz w:val="40"/>
+                <w:szCs w:val="40"/>
+              </w:rPr>
+              <w:t>qÉå</w:t>
+            </w:r>
+            <w:proofErr w:type="spellEnd"/>
+            <w:r>
+              <w:rPr>
+                <w:rFonts w:ascii="BRH Devanagari Extra" w:hAnsi="BRH Devanagari Extra" w:cs="BRH Devanagari Extra"/>
+                <w:color w:val="000000"/>
+                <w:sz w:val="40"/>
+                <w:szCs w:val="40"/>
+              </w:rPr>
+              <w:t xml:space="preserve"> ÅWû³Éçþ | </w:t>
+            </w:r>
+            <w:proofErr w:type="spellStart"/>
+            <w:r>
+              <w:rPr>
+                <w:rFonts w:ascii="BRH Devanagari Extra" w:hAnsi="BRH Devanagari Extra" w:cs="BRH Devanagari Extra"/>
+                <w:color w:val="000000"/>
+                <w:sz w:val="40"/>
+                <w:szCs w:val="40"/>
+              </w:rPr>
+              <w:t>AWûþ</w:t>
             </w:r>
             <w:r>
               <w:rPr>
@@ -3127,6 +5954,7 @@
               </w:rPr>
               <w:t>Xç</w:t>
             </w:r>
+            <w:proofErr w:type="spellEnd"/>
             <w:r>
               <w:rPr>
                 <w:rFonts w:ascii="BRH Devanagari Extra" w:hAnsi="BRH Devanagari Extra" w:cs="BRH Devanagari Extra"/>
@@ -3191,14 +6019,35 @@
               </w:rPr>
               <w:t>–</w:t>
             </w:r>
-            <w:r>
-              <w:rPr>
-                <w:rFonts w:ascii="BRH Devanagari Extra" w:hAnsi="BRH Devanagari Extra" w:cs="BRH Devanagari Extra"/>
-                <w:color w:val="000000"/>
-                <w:sz w:val="40"/>
-                <w:szCs w:val="40"/>
-              </w:rPr>
-              <w:t>qÉå ÅWû³Éçþ | AWûþ</w:t>
+            <w:proofErr w:type="spellStart"/>
+            <w:r>
+              <w:rPr>
+                <w:rFonts w:ascii="BRH Devanagari Extra" w:hAnsi="BRH Devanagari Extra" w:cs="BRH Devanagari Extra"/>
+                <w:color w:val="000000"/>
+                <w:sz w:val="40"/>
+                <w:szCs w:val="40"/>
+              </w:rPr>
+              <w:t>qÉå</w:t>
+            </w:r>
+            <w:proofErr w:type="spellEnd"/>
+            <w:r>
+              <w:rPr>
+                <w:rFonts w:ascii="BRH Devanagari Extra" w:hAnsi="BRH Devanagari Extra" w:cs="BRH Devanagari Extra"/>
+                <w:color w:val="000000"/>
+                <w:sz w:val="40"/>
+                <w:szCs w:val="40"/>
+              </w:rPr>
+              <w:t xml:space="preserve"> ÅWû³Éçþ | </w:t>
+            </w:r>
+            <w:proofErr w:type="spellStart"/>
+            <w:r>
+              <w:rPr>
+                <w:rFonts w:ascii="BRH Devanagari Extra" w:hAnsi="BRH Devanagari Extra" w:cs="BRH Devanagari Extra"/>
+                <w:color w:val="000000"/>
+                <w:sz w:val="40"/>
+                <w:szCs w:val="40"/>
+              </w:rPr>
+              <w:t>AWûþ</w:t>
             </w:r>
             <w:r>
               <w:rPr>
@@ -3210,6 +6059,7 @@
               </w:rPr>
               <w:t>lÉç</w:t>
             </w:r>
+            <w:proofErr w:type="spellEnd"/>
             <w:r>
               <w:rPr>
                 <w:rFonts w:ascii="BRH Devanagari Extra" w:hAnsi="BRH Devanagari Extra" w:cs="BRH Devanagari Extra"/>
@@ -3251,7 +6101,29 @@
           <w:szCs w:val="40"/>
           <w:lang w:val="en-IN" w:eastAsia="en-IN"/>
         </w:rPr>
-        <w:t xml:space="preserve">"zlÉ" </w:t>
+        <w:t>"</w:t>
+      </w:r>
+      <w:proofErr w:type="spellStart"/>
+      <w:r>
+        <w:rPr>
+          <w:rFonts w:ascii="BRH Devanagari" w:hAnsi="BRH Devanagari" w:cs="BRH Devanagari"/>
+          <w:color w:val="000000"/>
+          <w:sz w:val="40"/>
+          <w:szCs w:val="40"/>
+          <w:lang w:val="en-IN" w:eastAsia="en-IN"/>
+        </w:rPr>
+        <w:t>zlÉ</w:t>
+      </w:r>
+      <w:proofErr w:type="spellEnd"/>
+      <w:r>
+        <w:rPr>
+          <w:rFonts w:ascii="BRH Devanagari" w:hAnsi="BRH Devanagari" w:cs="BRH Devanagari"/>
+          <w:color w:val="000000"/>
+          <w:sz w:val="40"/>
+          <w:szCs w:val="40"/>
+          <w:lang w:val="en-IN" w:eastAsia="en-IN"/>
+        </w:rPr>
+        <w:t xml:space="preserve">" </w:t>
       </w:r>
       <w:r>
         <w:rPr>
@@ -3281,6 +6153,7 @@
         </w:rPr>
         <w:t>"</w:t>
       </w:r>
+      <w:proofErr w:type="spellStart"/>
       <w:r>
         <w:rPr>
           <w:rFonts w:ascii="BRH Devanagari" w:hAnsi="BRH Devanagari" w:cs="BRH Devanagari"/>
@@ -3292,6 +6165,7 @@
         </w:rPr>
         <w:t>zgÉ</w:t>
       </w:r>
+      <w:proofErr w:type="spellEnd"/>
       <w:r>
         <w:rPr>
           <w:rFonts w:ascii="BRH Devanagari" w:hAnsi="BRH Devanagari" w:cs="BRH Devanagari"/>
@@ -3440,7 +6314,6 @@
           <w:b/>
           <w:bCs/>
         </w:rPr>
-        <w:lastRenderedPageBreak/>
         <w:t xml:space="preserve"> </w:t>
       </w:r>
       <w:r>
@@ -3685,6 +6558,8 @@
       <w:headerReference w:type="default" r:id="rId8"/>
       <w:footerReference w:type="even" r:id="rId9"/>
       <w:footerReference w:type="default" r:id="rId10"/>
+      <w:headerReference w:type="first" r:id="rId11"/>
+      <w:footerReference w:type="first" r:id="rId12"/>
       <w:pgSz w:w="15840" w:h="12240" w:orient="landscape"/>
       <w:pgMar w:top="1440" w:right="1440" w:bottom="1440" w:left="1440" w:header="720" w:footer="720" w:gutter="0"/>
       <w:cols w:space="720"/>
@@ -3773,14 +6648,35 @@
         <w:bCs/>
       </w:rPr>
       <w:tab/>
-      <w:t xml:space="preserve">              v</w:t>
+      <w:t xml:space="preserve">             </w:t>
     </w:r>
     <w:r>
       <w:rPr>
         <w:b/>
         <w:bCs/>
       </w:rPr>
-      <w:t>edavms@gmail.com</w:t>
+      <w:t>www.</w:t>
+    </w:r>
+    <w:r>
+      <w:rPr>
+        <w:b/>
+        <w:bCs/>
+      </w:rPr>
+      <w:t>v</w:t>
+    </w:r>
+    <w:r>
+      <w:rPr>
+        <w:b/>
+        <w:bCs/>
+      </w:rPr>
+      <w:t>edavms</w:t>
+    </w:r>
+    <w:r>
+      <w:rPr>
+        <w:b/>
+        <w:bCs/>
+      </w:rPr>
+      <w:t>.in</w:t>
     </w:r>
     <w:r>
       <w:rPr>
@@ -3796,6 +6692,13 @@
       </w:rPr>
       <w:tab/>
       <w:t xml:space="preserve"> </w:t>
+    </w:r>
+    <w:r>
+      <w:rPr>
+        <w:b/>
+        <w:bCs/>
+      </w:rPr>
+      <w:t xml:space="preserve">           </w:t>
     </w:r>
     <w:r>
       <w:tab/>
@@ -4104,6 +7007,16 @@
 </w:ftr>
 </file>
 
+<file path=word/footer3.xml><?xml version="1.0" encoding="utf-8"?>
+<w:ftr xmlns:wpc="http://schemas.microsoft.com/office/word/2010/wordprocessingCanvas" xmlns:cx="http://schemas.microsoft.com/office/drawing/2014/chartex" xmlns:cx1="http://schemas.microsoft.com/office/drawing/2015/9/8/chartex" xmlns:cx2="http://schemas.microsoft.com/office/drawing/2015/10/21/chartex" xmlns:cx3="http://schemas.microsoft.com/office/drawing/2016/5/9/chartex" xmlns:cx4="http://schemas.microsoft.com/office/drawing/2016/5/10/chartex" xmlns:cx5="http://schemas.microsoft.com/office/drawing/2016/5/11/chartex" xmlns:cx6="http://schemas.microsoft.com/office/drawing/2016/5/12/chartex" xmlns:cx7="http://schemas.microsoft.com/office/drawing/2016/5/13/chartex" xmlns:cx8="http://schemas.microsoft.com/office/drawing/2016/5/14/chartex" xmlns:mc="http://schemas.openxmlformats.org/markup-compatibility/2006" xmlns:aink="http://schemas.microsoft.com/office/drawing/2016/ink" xmlns:am3d="http://schemas.microsoft.com/office/drawing/2017/model3d" xmlns:o="urn:schemas-microsoft-com:office:office" xmlns:oel="http://schemas.microsoft.com/office/2019/extlst" xmlns:r="http://schemas.openxmlformats.org/officeDocument/2006/relationships" xmlns:m="http://schemas.openxmlformats.org/officeDocument/2006/math" xmlns:v="urn:schemas-microsoft-com:vml" xmlns:wp14="http://schemas.microsoft.com/office/word/2010/wordprocessingDrawing" xmlns:wp="http://schemas.openxmlformats.org/drawingml/2006/wordprocessingDrawing" xmlns:w10="urn:schemas-microsoft-com:office:word" xmlns:w="http://schemas.openxmlformats.org/wordprocessingml/2006/main" xmlns:w14="http://schemas.microsoft.com/office/word/2010/wordml" xmlns:w15="http://schemas.microsoft.com/office/word/2012/wordml" xmlns:w16cex="http://schemas.microsoft.com/office/word/2018/wordml/cex" xmlns:w16cid="http://schemas.microsoft.com/office/word/2016/wordml/cid" xmlns:w16="http://schemas.microsoft.com/office/word/2018/wordml" xmlns:w16du="http://schemas.microsoft.com/office/word/2023/wordml/word16du" xmlns:w16sdtdh="http://schemas.microsoft.com/office/word/2020/wordml/sdtdatahash" xmlns:w16sdtfl="http://schemas.microsoft.com/office/word/2024/wordml/sdtformatlock" xmlns:w16se="http://schemas.microsoft.com/office/word/2015/wordml/symex" xmlns:wpg="http://schemas.microsoft.com/office/word/2010/wordprocessingGroup" xmlns:wpi="http://schemas.microsoft.com/office/word/2010/wordprocessingInk" xmlns:wne="http://schemas.microsoft.com/office/word/2006/wordml" xmlns:wps="http://schemas.microsoft.com/office/word/2010/wordprocessingShape" mc:Ignorable="w14 w15 w16se w16cid w16 w16cex w16sdtdh w16sdtfl w16du wp14">
+  <w:p>
+    <w:pPr>
+      <w:pStyle w:val="Footer"/>
+    </w:pPr>
+  </w:p>
+</w:ftr>
+</file>
+
 <file path=word/footnotes.xml><?xml version="1.0" encoding="utf-8"?>
 <w:footnotes xmlns:wpc="http://schemas.microsoft.com/office/word/2010/wordprocessingCanvas" xmlns:cx="http://schemas.microsoft.com/office/drawing/2014/chartex" xmlns:cx1="http://schemas.microsoft.com/office/drawing/2015/9/8/chartex" xmlns:cx2="http://schemas.microsoft.com/office/drawing/2015/10/21/chartex" xmlns:cx3="http://schemas.microsoft.com/office/drawing/2016/5/9/chartex" xmlns:cx4="http://schemas.microsoft.com/office/drawing/2016/5/10/chartex" xmlns:cx5="http://schemas.microsoft.com/office/drawing/2016/5/11/chartex" xmlns:cx6="http://schemas.microsoft.com/office/drawing/2016/5/12/chartex" xmlns:cx7="http://schemas.microsoft.com/office/drawing/2016/5/13/chartex" xmlns:cx8="http://schemas.microsoft.com/office/drawing/2016/5/14/chartex" xmlns:mc="http://schemas.openxmlformats.org/markup-compatibility/2006" xmlns:aink="http://schemas.microsoft.com/office/drawing/2016/ink" xmlns:am3d="http://schemas.microsoft.com/office/drawing/2017/model3d" xmlns:o="urn:schemas-microsoft-com:office:office" xmlns:oel="http://schemas.microsoft.com/office/2019/extlst" xmlns:r="http://schemas.openxmlformats.org/officeDocument/2006/relationships" xmlns:m="http://schemas.openxmlformats.org/officeDocument/2006/math" xmlns:v="urn:schemas-microsoft-com:vml" xmlns:wp14="http://schemas.microsoft.com/office/word/2010/wordprocessingDrawing" xmlns:wp="http://schemas.openxmlformats.org/drawingml/2006/wordprocessingDrawing" xmlns:w10="urn:schemas-microsoft-com:office:word" xmlns:w="http://schemas.openxmlformats.org/wordprocessingml/2006/main" xmlns:w14="http://schemas.microsoft.com/office/word/2010/wordml" xmlns:w15="http://schemas.microsoft.com/office/word/2012/wordml" xmlns:w16cex="http://schemas.microsoft.com/office/word/2018/wordml/cex" xmlns:w16cid="http://schemas.microsoft.com/office/word/2016/wordml/cid" xmlns:w16="http://schemas.microsoft.com/office/word/2018/wordml" xmlns:w16du="http://schemas.microsoft.com/office/word/2023/wordml/word16du" xmlns:w16sdtdh="http://schemas.microsoft.com/office/word/2020/wordml/sdtdatahash" xmlns:w16sdtfl="http://schemas.microsoft.com/office/word/2024/wordml/sdtformatlock" xmlns:w16se="http://schemas.microsoft.com/office/word/2015/wordml/symex" xmlns:wpg="http://schemas.microsoft.com/office/word/2010/wordprocessingGroup" xmlns:wpi="http://schemas.microsoft.com/office/word/2010/wordprocessingInk" xmlns:wne="http://schemas.microsoft.com/office/word/2006/wordml" xmlns:wps="http://schemas.microsoft.com/office/word/2010/wordprocessingShape" mc:Ignorable="w14 w15 w16se w16cid w16 w16cex w16sdtdh w16sdtfl w16du wp14">
   <w:footnote w:type="separator" w:id="-1">
@@ -4150,6 +7063,16 @@
       <w:pBdr>
         <w:bottom w:val="single" w:sz="4" w:space="1" w:color="auto"/>
       </w:pBdr>
+    </w:pPr>
+  </w:p>
+</w:hdr>
+</file>
+
+<file path=word/header3.xml><?xml version="1.0" encoding="utf-8"?>
+<w:hdr xmlns:wpc="http://schemas.microsoft.com/office/word/2010/wordprocessingCanvas" xmlns:cx="http://schemas.microsoft.com/office/drawing/2014/chartex" xmlns:cx1="http://schemas.microsoft.com/office/drawing/2015/9/8/chartex" xmlns:cx2="http://schemas.microsoft.com/office/drawing/2015/10/21/chartex" xmlns:cx3="http://schemas.microsoft.com/office/drawing/2016/5/9/chartex" xmlns:cx4="http://schemas.microsoft.com/office/drawing/2016/5/10/chartex" xmlns:cx5="http://schemas.microsoft.com/office/drawing/2016/5/11/chartex" xmlns:cx6="http://schemas.microsoft.com/office/drawing/2016/5/12/chartex" xmlns:cx7="http://schemas.microsoft.com/office/drawing/2016/5/13/chartex" xmlns:cx8="http://schemas.microsoft.com/office/drawing/2016/5/14/chartex" xmlns:mc="http://schemas.openxmlformats.org/markup-compatibility/2006" xmlns:aink="http://schemas.microsoft.com/office/drawing/2016/ink" xmlns:am3d="http://schemas.microsoft.com/office/drawing/2017/model3d" xmlns:o="urn:schemas-microsoft-com:office:office" xmlns:oel="http://schemas.microsoft.com/office/2019/extlst" xmlns:r="http://schemas.openxmlformats.org/officeDocument/2006/relationships" xmlns:m="http://schemas.openxmlformats.org/officeDocument/2006/math" xmlns:v="urn:schemas-microsoft-com:vml" xmlns:wp14="http://schemas.microsoft.com/office/word/2010/wordprocessingDrawing" xmlns:wp="http://schemas.openxmlformats.org/drawingml/2006/wordprocessingDrawing" xmlns:w10="urn:schemas-microsoft-com:office:word" xmlns:w="http://schemas.openxmlformats.org/wordprocessingml/2006/main" xmlns:w14="http://schemas.microsoft.com/office/word/2010/wordml" xmlns:w15="http://schemas.microsoft.com/office/word/2012/wordml" xmlns:w16cex="http://schemas.microsoft.com/office/word/2018/wordml/cex" xmlns:w16cid="http://schemas.microsoft.com/office/word/2016/wordml/cid" xmlns:w16="http://schemas.microsoft.com/office/word/2018/wordml" xmlns:w16du="http://schemas.microsoft.com/office/word/2023/wordml/word16du" xmlns:w16sdtdh="http://schemas.microsoft.com/office/word/2020/wordml/sdtdatahash" xmlns:w16sdtfl="http://schemas.microsoft.com/office/word/2024/wordml/sdtformatlock" xmlns:w16se="http://schemas.microsoft.com/office/word/2015/wordml/symex" xmlns:wpg="http://schemas.microsoft.com/office/word/2010/wordprocessingGroup" xmlns:wpi="http://schemas.microsoft.com/office/word/2010/wordprocessingInk" xmlns:wne="http://schemas.microsoft.com/office/word/2006/wordml" xmlns:wps="http://schemas.microsoft.com/office/word/2010/wordprocessingShape" mc:Ignorable="w14 w15 w16se w16cid w16 w16cex w16sdtdh w16sdtfl w16du wp14">
+  <w:p>
+    <w:pPr>
+      <w:pStyle w:val="Header"/>
     </w:pPr>
   </w:p>
 </w:hdr>

</xml_diff>